<commit_message>
Colab GPU training results: fine-tuned CNNs, IMU 1-D CNN, retrained head, U-Net segmenter, RDD2022 detector, claims
Co-Authored-By: Claude Opus 5.5 <noreply@anthropic.com>
</commit_message>
<xml_diff>
--- a/CSET485_ROAD_SHIELD_Milestone2_Report_Audited_TrackedChanges.docx
+++ b/CSET485_ROAD_SHIELD_Milestone2_Report_Audited_TrackedChanges.docx
@@ -686,7 +686,7 @@
       </w:del>
       <w:ins w:id="30006" w:author="Claude (audit 2026-10-03)" w:date="2026-10-03T00:00:00Z">
         <w:r>
-          <w:t xml:space="preserve">It uses a frozen ImageNet MobileNetV2 feature backbone with a trained classifier head, run on CPU via ONNX Runtime to sort each region into 7 road-condition classes,</w:t>
+          <w:t xml:space="preserve">It uses an ImageNet-pretrained MobileNetV3-Large fine-tuned end to end on our road photographs, run on CPU via ONNX Runtime to sort each region into 7 road-condition classes,</w:t>
         </w:r>
       </w:ins>
       <w:r>
@@ -733,7 +733,7 @@
       </w:ins>
       <w:ins w:id="30015" w:author="Claude (audit 2026-10-03)" w:date="2026-10-03T00:00:00Z">
         <w:r>
-          <w:t xml:space="preserve">our classifier scored 87.0% accuracy (macro-F1 0.700) on 625 images from 589 photographs it never saw, the hand-crafted baseline scored 79.0% on the same split, and the code has 176 automated tests (167 verified passing in this audit; the 9 segmenter tests need the pinned scikit-learn 1.8 environment). On 997 crops from RDD2022 India test photographs that no training run reads, the classifier scored 80.4% accuracy (macro-F1 0.781)</w:t>
+          <w:t xml:space="preserve">our classifier scored 93.3% accuracy (macro-F1 0.828) on 630 images from 567 photographs it never saw, the hand-crafted baseline scored 84.9% on the same split, and the code has 178 automated tests, 176 passing and 2 failing (see logs/tests_after.txt). On 1200 crops from RDD2022 India test photographs that no training run reads, the classifier scored 92.2% accuracy (macro-F1 0.922)</w:t>
         </w:r>
       </w:ins>
       <w:ins w:id="30016" w:author="Claude (fact-check vs repository)" w:date="2026-10-02T00:00:00Z">
@@ -1616,7 +1616,7 @@
                 <w:rPr>
                   <w:sz w:val="16"/>
                 </w:rPr>
-                <w:t xml:space="preserve">frozen ImageNet MobileNetV2 embeddings; 87.0% held-out accuracy</w:t>
+                <w:t xml:space="preserve">an ImageNet MobileNetV3-Large fine-tuned end to end; 93.3% held-out accuracy</w:t>
               </w:r>
             </w:ins>
             <w:ins w:id="30038" w:author="Claude (fact-check vs repository)" w:date="2026-10-02T00:00:00Z"/>
@@ -3184,7 +3184,7 @@
                 <w:rPr>
                   <w:sz w:val="16"/>
                 </w:rPr>
-                <w:t xml:space="preserve">Training: 1200 crack, 1147 pothole, 600 normal-road crops from 2173 photographs; Indian test set: 997 crops from 778 photographs</w:t>
+                <w:t xml:space="preserve">Training: 1200 crack, 1200 pothole, 600 normal-road crops from 1785 photographs; Indian test set: 1200 crops from 781 photographs</w:t>
               </w:r>
             </w:ins>
             <w:ins w:id="30078" w:author="Claude (fact-check vs repository)" w:date="2026-10-02T00:00:00Z"/>
@@ -4063,7 +4063,7 @@
       </w:ins>
       <w:ins w:id="30121" w:author="Claude (audit 2026-10-03)" w:date="2026-10-03T00:00:00Z">
         <w:r>
-          <w:t xml:space="preserve">classifying an image region in about 30 ms without needing a GPU; the full per-photograph pipeline (segmentation, semantic gate, classification, costing) averaged 3.5 s on the repository's recorded benchmark run.</w:t>
+          <w:t xml:space="preserve">classifying an image region in about 7 ms without needing a GPU; the full per-photograph pipeline (segmentation, semantic gate, classification, costing) averaged 2.6 s on a 2-thread CPU.</w:t>
         </w:r>
       </w:ins>
       <w:ins w:id="30122" w:author="Claude (fact-check vs repository)" w:date="2026-10-02T00:00:00Z"/>
@@ -4358,7 +4358,7 @@
       </w:ins>
       <w:ins w:id="30141" w:author="Claude (audit 2026-10-03)" w:date="2026-10-03T00:00:00Z">
         <w:r>
-          <w:t xml:space="preserve">Extracts 1000-d embeddings with a frozen ImageNet MobileNetV2, averaging each image with its mirror; a class-balanced SVC (C=3) head chosen by grouped cross-validation predicts across 7 distress classes.</w:t>
+          <w:t xml:space="preserve">An ImageNet-pretrained MobileNetV3-Large, fine-tuned end to end on the road corpus (chosen among 4 architectures on validation data, then refit on train+val), predicts across 7 distress classes, averaging each crop with its mirror. The frozen MobileNetV2 + scikit-learn head is kept as the fallback.</w:t>
         </w:r>
       </w:ins>
       <w:ins w:id="30142" w:author="Claude (fact-check vs repository)" w:date="2026-10-02T00:00:00Z"/>
@@ -4678,7 +4678,7 @@
                 <w:rPr>
                   <w:sz w:val="16"/>
                 </w:rPr>
-                <w:t xml:space="preserve">ImageNet MobileNetV2 Embeddings (ONNX Runtime)</w:t>
+                <w:t xml:space="preserve">ImageNet MobileNetV3-Large fine-tuned end to end (ONNX Runtime)</w:t>
               </w:r>
             </w:ins>
             <w:ins w:id="30154" w:author="Claude (fact-check vs repository)" w:date="2026-10-02T00:00:00Z"/>
@@ -4746,7 +4746,7 @@
                 <w:rPr>
                   <w:sz w:val="16"/>
                 </w:rPr>
-                <w:t xml:space="preserve">Pre-trained ImageNet features transfer well to road texture. On the identical split the CNN embeddings beat HOG/LBP (87.0% vs 79.0% accuracy), at about 30 ms per image on CPU.</w:t>
+                <w:t xml:space="preserve">On the identical split the fine-tuned network scored 93.3% (macro-F1 0.828), the frozen MobileNetV2 head 87.9% (macro-F1 0.745) and HOG/LBP 84.9%; it was selected by a rule fixed before test scores were read (it had to beat the head on both accuracy and macro-F1 on non-test data). About 7 ms per image on CPU.</w:t>
               </w:r>
             </w:ins>
             <w:ins w:id="30160" w:author="Claude (fact-check vs repository)" w:date="2026-10-02T00:00:00Z"/>
@@ -4810,7 +4810,7 @@
                 <w:rPr>
                   <w:sz w:val="16"/>
                 </w:rPr>
-                <w:t xml:space="preserve">Class-balanced SVC-RBF (C=3) on mirror-averaged embeddings</w:t>
+                <w:t xml:space="preserve">Linear classifier inside the fine-tuned MobileNetV3-Large (label smoothing, square-root class-balanced sampling)</w:t>
               </w:r>
             </w:ins>
             <w:ins w:id="30166" w:author="Claude (fact-check vs repository)" w:date="2026-10-02T00:00:00Z"/>
@@ -4836,14 +4836,26 @@
                 <w:delText xml:space="preserve">SVC-RBF; Multi-Layer Perceptron (MLP)</w:delText>
               </w:r>
             </w:del>
-            <w:ins w:id="30168" w:author="Claude (fact-check vs repository)" w:date="2026-10-02T00:00:00Z">
+            <w:ins w:id="30168" w:author="Claude (fact-check vs repository)" w:date="2026-10-02T00:00:00Z"/>
+            <w:ins w:id="30169" w:author="Claude (fact-check vs repository)" w:date="2026-10-02T00:00:00Z">
+              <w:del w:id="30170" w:author="Claude (audit 2026-10-03)" w:date="2026-10-03T00:00:00Z">
+                <w:r>
+                  <w:rPr>
+                    <w:sz w:val="16"/>
+                  </w:rPr>
+                  <w:delText xml:space="preserve">Each head alone; logistic regression at two regularisation strengths; SVC-RBF at three</w:delText>
+                </w:r>
+              </w:del>
+            </w:ins>
+            <w:ins w:id="30171" w:author="Claude (audit 2026-10-03)" w:date="2026-10-03T00:00:00Z">
               <w:r>
                 <w:rPr>
                   <w:sz w:val="16"/>
                 </w:rPr>
-                <w:t xml:space="preserve">Each head alone; logistic regression at two regularisation strengths; SVC-RBF at three</w:t>
+                <w:t xml:space="preserve">Frozen MobileNetV2 + soft-voting head; efficientnet_b0, efficientnet_b2, resnet50 fine-tuned the same way</w:t>
               </w:r>
             </w:ins>
+            <w:ins w:id="30172" w:author="Claude (fact-check vs repository)" w:date="2026-10-02T00:00:00Z"/>
           </w:p>
         </w:tc>
         <w:tc>
@@ -4858,7 +4870,7 @@
             </w:tcMar>
           </w:tcPr>
           <w:p>
-            <w:del w:id="30169" w:author="Claude (fact-check vs repository)" w:date="2026-10-02T00:00:00Z">
+            <w:del w:id="30173" w:author="Claude (fact-check vs repository)" w:date="2026-10-02T00:00:00Z">
               <w:r>
                 <w:rPr>
                   <w:sz w:val="16"/>
@@ -4866,9 +4878,9 @@
                 <w:delText xml:space="preserve">Beat SVC-RBF (89.2% vs 86.9% accuracy).</w:delText>
               </w:r>
             </w:del>
-            <w:ins w:id="30170" w:author="Claude (fact-check vs repository)" w:date="2026-10-02T00:00:00Z"/>
-            <w:ins w:id="30171" w:author="Claude (fact-check vs repository)" w:date="2026-10-02T00:00:00Z">
-              <w:del w:id="30172" w:author="Claude (audit 2026-10-03)" w:date="2026-10-03T00:00:00Z">
+            <w:ins w:id="30174" w:author="Claude (fact-check vs repository)" w:date="2026-10-02T00:00:00Z"/>
+            <w:ins w:id="30175" w:author="Claude (fact-check vs repository)" w:date="2026-10-02T00:00:00Z">
+              <w:del w:id="30176" w:author="Claude (audit 2026-10-03)" w:date="2026-10-03T00:00:00Z">
                 <w:r>
                   <w:rPr>
                     <w:sz w:val="16"/>
@@ -4877,15 +4889,15 @@
                 </w:r>
               </w:del>
             </w:ins>
-            <w:ins w:id="30173" w:author="Claude (audit 2026-10-03)" w:date="2026-10-03T00:00:00Z">
+            <w:ins w:id="30177" w:author="Claude (audit 2026-10-03)" w:date="2026-10-03T00:00:00Z">
               <w:r>
                 <w:rPr>
                   <w:sz w:val="16"/>
                 </w:rPr>
-                <w:t xml:space="preserve">Selected by 5-fold cross-validation grouped by source photograph within the training split (CV accuracy 80.4%, macro-F1 0.751, best of 13 candidates); the held-out test set was used once, to score the selected model.</w:t>
+                <w:t xml:space="preserve">Selected on the validation split (accuracy 91.8%, macro-F1 0.881); the held-out test set was scored once per architecture and never used to choose.</w:t>
               </w:r>
             </w:ins>
-            <w:ins w:id="30174" w:author="Claude (fact-check vs repository)" w:date="2026-10-02T00:00:00Z"/>
+            <w:ins w:id="30178" w:author="Claude (fact-check vs repository)" w:date="2026-10-02T00:00:00Z"/>
             <w:r>
               <w:rPr>
                 <w:sz w:val="16"/>
@@ -5214,7 +5226,7 @@
             </w:tcMar>
           </w:tcPr>
           <w:p>
-            <w:del w:id="30175" w:author="Claude (audit 2026-10-03)" w:date="2026-10-03T00:00:00Z">
+            <w:del w:id="30179" w:author="Claude (audit 2026-10-03)" w:date="2026-10-03T00:00:00Z">
               <w:r>
                 <w:rPr>
                   <w:sz w:val="16"/>
@@ -5222,7 +5234,7 @@
                 <w:delText xml:space="preserve">GPS receivers drift 3 to 5 meters in urban street canyons. Haversine clustering handles Earth curvature and GPS jitter, preventing multiple tickets for the same pothole.</w:delText>
               </w:r>
             </w:del>
-            <w:ins w:id="30176" w:author="Claude (audit 2026-10-03)" w:date="2026-10-03T00:00:00Z">
+            <w:ins w:id="30180" w:author="Claude (audit 2026-10-03)" w:date="2026-10-03T00:00:00Z">
               <w:r>
                 <w:rPr>
                   <w:sz w:val="16"/>
@@ -5493,7 +5505,7 @@
             </w:tcMar>
           </w:tcPr>
           <w:p>
-            <w:del w:id="30177" w:author="Claude (fact-check vs repository)" w:date="2026-10-02T00:00:00Z">
+            <w:del w:id="30181" w:author="Claude (fact-check vs repository)" w:date="2026-10-02T00:00:00Z">
               <w:r>
                 <w:rPr>
                   <w:sz w:val="17"/>
@@ -5501,9 +5513,9 @@
                 <w:delText xml:space="preserve">0.98</w:delText>
               </w:r>
             </w:del>
-            <w:ins w:id="30178" w:author="Claude (fact-check vs repository)" w:date="2026-10-02T00:00:00Z"/>
-            <w:ins w:id="30179" w:author="Claude (fact-check vs repository)" w:date="2026-10-02T00:00:00Z">
-              <w:del w:id="30180" w:author="Claude (audit 2026-10-03)" w:date="2026-10-03T00:00:00Z">
+            <w:ins w:id="30182" w:author="Claude (fact-check vs repository)" w:date="2026-10-02T00:00:00Z"/>
+            <w:ins w:id="30183" w:author="Claude (fact-check vs repository)" w:date="2026-10-02T00:00:00Z">
+              <w:del w:id="30184" w:author="Claude (audit 2026-10-03)" w:date="2026-10-03T00:00:00Z">
                 <w:r>
                   <w:rPr>
                     <w:sz w:val="17"/>
@@ -5512,15 +5524,15 @@
                 </w:r>
               </w:del>
             </w:ins>
-            <w:ins w:id="30181" w:author="Claude (audit 2026-10-03)" w:date="2026-10-03T00:00:00Z">
+            <w:ins w:id="30185" w:author="Claude (audit 2026-10-03)" w:date="2026-10-03T00:00:00Z">
               <w:r>
                 <w:rPr>
                   <w:sz w:val="17"/>
                 </w:rPr>
-                <w:t xml:space="preserve">0.85</w:t>
+                <w:t xml:space="preserve">0.97</w:t>
               </w:r>
             </w:ins>
-            <w:ins w:id="30182" w:author="Claude (fact-check vs repository)" w:date="2026-10-02T00:00:00Z"/>
+            <w:ins w:id="30186" w:author="Claude (fact-check vs repository)" w:date="2026-10-02T00:00:00Z"/>
           </w:p>
         </w:tc>
         <w:tc>
@@ -5535,7 +5547,7 @@
             </w:tcMar>
           </w:tcPr>
           <w:p>
-            <w:del w:id="30183" w:author="Claude (fact-check vs repository)" w:date="2026-10-02T00:00:00Z">
+            <w:del w:id="30187" w:author="Claude (fact-check vs repository)" w:date="2026-10-02T00:00:00Z">
               <w:r>
                 <w:rPr>
                   <w:sz w:val="17"/>
@@ -5543,9 +5555,9 @@
                 <w:delText xml:space="preserve">0.90</w:delText>
               </w:r>
             </w:del>
-            <w:ins w:id="30184" w:author="Claude (fact-check vs repository)" w:date="2026-10-02T00:00:00Z"/>
-            <w:ins w:id="30185" w:author="Claude (fact-check vs repository)" w:date="2026-10-02T00:00:00Z">
-              <w:del w:id="30186" w:author="Claude (audit 2026-10-03)" w:date="2026-10-03T00:00:00Z">
+            <w:ins w:id="30188" w:author="Claude (fact-check vs repository)" w:date="2026-10-02T00:00:00Z"/>
+            <w:ins w:id="30189" w:author="Claude (fact-check vs repository)" w:date="2026-10-02T00:00:00Z">
+              <w:del w:id="30190" w:author="Claude (audit 2026-10-03)" w:date="2026-10-03T00:00:00Z">
                 <w:r>
                   <w:rPr>
                     <w:sz w:val="17"/>
@@ -5554,15 +5566,15 @@
                 </w:r>
               </w:del>
             </w:ins>
-            <w:ins w:id="30187" w:author="Claude (audit 2026-10-03)" w:date="2026-10-03T00:00:00Z">
+            <w:ins w:id="30191" w:author="Claude (audit 2026-10-03)" w:date="2026-10-03T00:00:00Z">
               <w:r>
                 <w:rPr>
                   <w:sz w:val="17"/>
                 </w:rPr>
-                <w:t xml:space="preserve">0.94</w:t>
+                <w:t xml:space="preserve">0.97</w:t>
               </w:r>
             </w:ins>
-            <w:ins w:id="30188" w:author="Claude (fact-check vs repository)" w:date="2026-10-02T00:00:00Z"/>
+            <w:ins w:id="30192" w:author="Claude (fact-check vs repository)" w:date="2026-10-02T00:00:00Z"/>
           </w:p>
         </w:tc>
         <w:tc>
@@ -5577,7 +5589,7 @@
             </w:tcMar>
           </w:tcPr>
           <w:p>
-            <w:del w:id="30189" w:author="Claude (fact-check vs repository)" w:date="2026-10-02T00:00:00Z">
+            <w:del w:id="30193" w:author="Claude (fact-check vs repository)" w:date="2026-10-02T00:00:00Z">
               <w:r>
                 <w:rPr>
                   <w:sz w:val="17"/>
@@ -5585,9 +5597,9 @@
                 <w:delText xml:space="preserve">0.94</w:delText>
               </w:r>
             </w:del>
-            <w:ins w:id="30190" w:author="Claude (fact-check vs repository)" w:date="2026-10-02T00:00:00Z"/>
-            <w:ins w:id="30191" w:author="Claude (fact-check vs repository)" w:date="2026-10-02T00:00:00Z">
-              <w:del w:id="30192" w:author="Claude (audit 2026-10-03)" w:date="2026-10-03T00:00:00Z">
+            <w:ins w:id="30194" w:author="Claude (fact-check vs repository)" w:date="2026-10-02T00:00:00Z"/>
+            <w:ins w:id="30195" w:author="Claude (fact-check vs repository)" w:date="2026-10-02T00:00:00Z">
+              <w:del w:id="30196" w:author="Claude (audit 2026-10-03)" w:date="2026-10-03T00:00:00Z">
                 <w:r>
                   <w:rPr>
                     <w:sz w:val="17"/>
@@ -5596,15 +5608,15 @@
                 </w:r>
               </w:del>
             </w:ins>
-            <w:ins w:id="30193" w:author="Claude (audit 2026-10-03)" w:date="2026-10-03T00:00:00Z">
+            <w:ins w:id="30197" w:author="Claude (audit 2026-10-03)" w:date="2026-10-03T00:00:00Z">
               <w:r>
                 <w:rPr>
                   <w:sz w:val="17"/>
                 </w:rPr>
-                <w:t xml:space="preserve">0.89</w:t>
+                <w:t xml:space="preserve">0.97</w:t>
               </w:r>
             </w:ins>
-            <w:ins w:id="30194" w:author="Claude (fact-check vs repository)" w:date="2026-10-02T00:00:00Z"/>
+            <w:ins w:id="30198" w:author="Claude (fact-check vs repository)" w:date="2026-10-02T00:00:00Z"/>
           </w:p>
         </w:tc>
         <w:tc>
@@ -5619,7 +5631,7 @@
             </w:tcMar>
           </w:tcPr>
           <w:p>
-            <w:del w:id="30195" w:author="Claude (fact-check vs repository)" w:date="2026-10-02T00:00:00Z">
+            <w:del w:id="30199" w:author="Claude (fact-check vs repository)" w:date="2026-10-02T00:00:00Z">
               <w:r>
                 <w:rPr>
                   <w:sz w:val="17"/>
@@ -5627,9 +5639,9 @@
                 <w:delText xml:space="preserve">140</w:delText>
               </w:r>
             </w:del>
-            <w:ins w:id="30196" w:author="Claude (fact-check vs repository)" w:date="2026-10-02T00:00:00Z"/>
-            <w:ins w:id="30197" w:author="Claude (fact-check vs repository)" w:date="2026-10-02T00:00:00Z">
-              <w:del w:id="30198" w:author="Claude (audit 2026-10-03)" w:date="2026-10-03T00:00:00Z">
+            <w:ins w:id="30200" w:author="Claude (fact-check vs repository)" w:date="2026-10-02T00:00:00Z"/>
+            <w:ins w:id="30201" w:author="Claude (fact-check vs repository)" w:date="2026-10-02T00:00:00Z">
+              <w:del w:id="30202" w:author="Claude (audit 2026-10-03)" w:date="2026-10-03T00:00:00Z">
                 <w:r>
                   <w:rPr>
                     <w:sz w:val="17"/>
@@ -5638,7 +5650,7 @@
                 </w:r>
               </w:del>
             </w:ins>
-            <w:ins w:id="30199" w:author="Claude (audit 2026-10-03)" w:date="2026-10-03T00:00:00Z">
+            <w:ins w:id="30203" w:author="Claude (audit 2026-10-03)" w:date="2026-10-03T00:00:00Z">
               <w:r>
                 <w:rPr>
                   <w:sz w:val="17"/>
@@ -5646,7 +5658,7 @@
                 <w:t xml:space="preserve">148</w:t>
               </w:r>
             </w:ins>
-            <w:ins w:id="30200" w:author="Claude (fact-check vs repository)" w:date="2026-10-02T00:00:00Z"/>
+            <w:ins w:id="30204" w:author="Claude (fact-check vs repository)" w:date="2026-10-02T00:00:00Z"/>
           </w:p>
         </w:tc>
       </w:tr>
@@ -5683,7 +5695,7 @@
             </w:tcMar>
           </w:tcPr>
           <w:p>
-            <w:del w:id="30201" w:author="Claude (fact-check vs repository)" w:date="2026-10-02T00:00:00Z">
+            <w:del w:id="30205" w:author="Claude (fact-check vs repository)" w:date="2026-10-02T00:00:00Z">
               <w:r>
                 <w:rPr>
                   <w:sz w:val="17"/>
@@ -5691,9 +5703,9 @@
                 <w:delText xml:space="preserve">0.84</w:delText>
               </w:r>
             </w:del>
-            <w:ins w:id="30202" w:author="Claude (fact-check vs repository)" w:date="2026-10-02T00:00:00Z"/>
-            <w:ins w:id="30203" w:author="Claude (fact-check vs repository)" w:date="2026-10-02T00:00:00Z">
-              <w:del w:id="30204" w:author="Claude (audit 2026-10-03)" w:date="2026-10-03T00:00:00Z">
+            <w:ins w:id="30206" w:author="Claude (fact-check vs repository)" w:date="2026-10-02T00:00:00Z"/>
+            <w:ins w:id="30207" w:author="Claude (fact-check vs repository)" w:date="2026-10-02T00:00:00Z">
+              <w:del w:id="30208" w:author="Claude (audit 2026-10-03)" w:date="2026-10-03T00:00:00Z">
                 <w:r>
                   <w:rPr>
                     <w:sz w:val="17"/>
@@ -5702,15 +5714,15 @@
                 </w:r>
               </w:del>
             </w:ins>
-            <w:ins w:id="30205" w:author="Claude (audit 2026-10-03)" w:date="2026-10-03T00:00:00Z">
+            <w:ins w:id="30209" w:author="Claude (audit 2026-10-03)" w:date="2026-10-03T00:00:00Z">
               <w:r>
                 <w:rPr>
                   <w:sz w:val="17"/>
                 </w:rPr>
-                <w:t xml:space="preserve">0.84</w:t>
+                <w:t xml:space="preserve">0.92</w:t>
               </w:r>
             </w:ins>
-            <w:ins w:id="30206" w:author="Claude (fact-check vs repository)" w:date="2026-10-02T00:00:00Z"/>
+            <w:ins w:id="30210" w:author="Claude (fact-check vs repository)" w:date="2026-10-02T00:00:00Z"/>
           </w:p>
         </w:tc>
         <w:tc>
@@ -5725,7 +5737,7 @@
             </w:tcMar>
           </w:tcPr>
           <w:p>
-            <w:del w:id="30207" w:author="Claude (fact-check vs repository)" w:date="2026-10-02T00:00:00Z">
+            <w:del w:id="30211" w:author="Claude (fact-check vs repository)" w:date="2026-10-02T00:00:00Z">
               <w:r>
                 <w:rPr>
                   <w:sz w:val="17"/>
@@ -5733,9 +5745,9 @@
                 <w:delText xml:space="preserve">0.91</w:delText>
               </w:r>
             </w:del>
-            <w:ins w:id="30208" w:author="Claude (fact-check vs repository)" w:date="2026-10-02T00:00:00Z"/>
-            <w:ins w:id="30209" w:author="Claude (fact-check vs repository)" w:date="2026-10-02T00:00:00Z">
-              <w:del w:id="30210" w:author="Claude (audit 2026-10-03)" w:date="2026-10-03T00:00:00Z">
+            <w:ins w:id="30212" w:author="Claude (fact-check vs repository)" w:date="2026-10-02T00:00:00Z"/>
+            <w:ins w:id="30213" w:author="Claude (fact-check vs repository)" w:date="2026-10-02T00:00:00Z">
+              <w:del w:id="30214" w:author="Claude (audit 2026-10-03)" w:date="2026-10-03T00:00:00Z">
                 <w:r>
                   <w:rPr>
                     <w:sz w:val="17"/>
@@ -5744,15 +5756,15 @@
                 </w:r>
               </w:del>
             </w:ins>
-            <w:ins w:id="30211" w:author="Claude (audit 2026-10-03)" w:date="2026-10-03T00:00:00Z">
+            <w:ins w:id="30215" w:author="Claude (audit 2026-10-03)" w:date="2026-10-03T00:00:00Z">
               <w:r>
                 <w:rPr>
                   <w:sz w:val="17"/>
                 </w:rPr>
-                <w:t xml:space="preserve">0.92</w:t>
+                <w:t xml:space="preserve">0.94</w:t>
               </w:r>
             </w:ins>
-            <w:ins w:id="30212" w:author="Claude (fact-check vs repository)" w:date="2026-10-02T00:00:00Z"/>
+            <w:ins w:id="30216" w:author="Claude (fact-check vs repository)" w:date="2026-10-02T00:00:00Z"/>
           </w:p>
         </w:tc>
         <w:tc>
@@ -5767,7 +5779,7 @@
             </w:tcMar>
           </w:tcPr>
           <w:p>
-            <w:del w:id="30213" w:author="Claude (fact-check vs repository)" w:date="2026-10-02T00:00:00Z">
+            <w:del w:id="30217" w:author="Claude (fact-check vs repository)" w:date="2026-10-02T00:00:00Z">
               <w:r>
                 <w:rPr>
                   <w:sz w:val="17"/>
@@ -5775,9 +5787,9 @@
                 <w:delText xml:space="preserve">0.87</w:delText>
               </w:r>
             </w:del>
-            <w:ins w:id="30214" w:author="Claude (fact-check vs repository)" w:date="2026-10-02T00:00:00Z"/>
-            <w:ins w:id="30215" w:author="Claude (fact-check vs repository)" w:date="2026-10-02T00:00:00Z">
-              <w:del w:id="30216" w:author="Claude (audit 2026-10-03)" w:date="2026-10-03T00:00:00Z">
+            <w:ins w:id="30218" w:author="Claude (fact-check vs repository)" w:date="2026-10-02T00:00:00Z"/>
+            <w:ins w:id="30219" w:author="Claude (fact-check vs repository)" w:date="2026-10-02T00:00:00Z">
+              <w:del w:id="30220" w:author="Claude (audit 2026-10-03)" w:date="2026-10-03T00:00:00Z">
                 <w:r>
                   <w:rPr>
                     <w:sz w:val="17"/>
@@ -5786,15 +5798,15 @@
                 </w:r>
               </w:del>
             </w:ins>
-            <w:ins w:id="30217" w:author="Claude (audit 2026-10-03)" w:date="2026-10-03T00:00:00Z">
+            <w:ins w:id="30221" w:author="Claude (audit 2026-10-03)" w:date="2026-10-03T00:00:00Z">
               <w:r>
                 <w:rPr>
                   <w:sz w:val="17"/>
                 </w:rPr>
-                <w:t xml:space="preserve">0.88</w:t>
+                <w:t xml:space="preserve">0.93</w:t>
               </w:r>
             </w:ins>
-            <w:ins w:id="30218" w:author="Claude (fact-check vs repository)" w:date="2026-10-02T00:00:00Z"/>
+            <w:ins w:id="30222" w:author="Claude (fact-check vs repository)" w:date="2026-10-02T00:00:00Z"/>
           </w:p>
         </w:tc>
         <w:tc>
@@ -5809,7 +5821,7 @@
             </w:tcMar>
           </w:tcPr>
           <w:p>
-            <w:del w:id="30219" w:author="Claude (fact-check vs repository)" w:date="2026-10-02T00:00:00Z">
+            <w:del w:id="30223" w:author="Claude (fact-check vs repository)" w:date="2026-10-02T00:00:00Z">
               <w:r>
                 <w:rPr>
                   <w:sz w:val="17"/>
@@ -5817,9 +5829,9 @@
                 <w:delText xml:space="preserve">120</w:delText>
               </w:r>
             </w:del>
-            <w:ins w:id="30220" w:author="Claude (fact-check vs repository)" w:date="2026-10-02T00:00:00Z"/>
-            <w:ins w:id="30221" w:author="Claude (fact-check vs repository)" w:date="2026-10-02T00:00:00Z">
-              <w:del w:id="30222" w:author="Claude (audit 2026-10-03)" w:date="2026-10-03T00:00:00Z">
+            <w:ins w:id="30224" w:author="Claude (fact-check vs repository)" w:date="2026-10-02T00:00:00Z"/>
+            <w:ins w:id="30225" w:author="Claude (fact-check vs repository)" w:date="2026-10-02T00:00:00Z">
+              <w:del w:id="30226" w:author="Claude (audit 2026-10-03)" w:date="2026-10-03T00:00:00Z">
                 <w:r>
                   <w:rPr>
                     <w:sz w:val="17"/>
@@ -5828,15 +5840,15 @@
                 </w:r>
               </w:del>
             </w:ins>
-            <w:ins w:id="30223" w:author="Claude (audit 2026-10-03)" w:date="2026-10-03T00:00:00Z">
+            <w:ins w:id="30227" w:author="Claude (audit 2026-10-03)" w:date="2026-10-03T00:00:00Z">
               <w:r>
                 <w:rPr>
                   <w:sz w:val="17"/>
                 </w:rPr>
-                <w:t xml:space="preserve">225</w:t>
+                <w:t xml:space="preserve">218</w:t>
               </w:r>
             </w:ins>
-            <w:ins w:id="30224" w:author="Claude (fact-check vs repository)" w:date="2026-10-02T00:00:00Z"/>
+            <w:ins w:id="30228" w:author="Claude (fact-check vs repository)" w:date="2026-10-02T00:00:00Z"/>
           </w:p>
         </w:tc>
       </w:tr>
@@ -5873,7 +5885,7 @@
             </w:tcMar>
           </w:tcPr>
           <w:p>
-            <w:del w:id="30225" w:author="Claude (fact-check vs repository)" w:date="2026-10-02T00:00:00Z">
+            <w:del w:id="30229" w:author="Claude (fact-check vs repository)" w:date="2026-10-02T00:00:00Z">
               <w:r>
                 <w:rPr>
                   <w:sz w:val="17"/>
@@ -5881,9 +5893,9 @@
                 <w:delText xml:space="preserve">0.89</w:delText>
               </w:r>
             </w:del>
-            <w:ins w:id="30226" w:author="Claude (fact-check vs repository)" w:date="2026-10-02T00:00:00Z"/>
-            <w:ins w:id="30227" w:author="Claude (fact-check vs repository)" w:date="2026-10-02T00:00:00Z">
-              <w:del w:id="30228" w:author="Claude (audit 2026-10-03)" w:date="2026-10-03T00:00:00Z">
+            <w:ins w:id="30230" w:author="Claude (fact-check vs repository)" w:date="2026-10-02T00:00:00Z"/>
+            <w:ins w:id="30231" w:author="Claude (fact-check vs repository)" w:date="2026-10-02T00:00:00Z">
+              <w:del w:id="30232" w:author="Claude (audit 2026-10-03)" w:date="2026-10-03T00:00:00Z">
                 <w:r>
                   <w:rPr>
                     <w:sz w:val="17"/>
@@ -5892,15 +5904,15 @@
                 </w:r>
               </w:del>
             </w:ins>
-            <w:ins w:id="30229" w:author="Claude (audit 2026-10-03)" w:date="2026-10-03T00:00:00Z">
+            <w:ins w:id="30233" w:author="Claude (audit 2026-10-03)" w:date="2026-10-03T00:00:00Z">
               <w:r>
                 <w:rPr>
                   <w:sz w:val="17"/>
                 </w:rPr>
-                <w:t xml:space="preserve">0.92</w:t>
+                <w:t xml:space="preserve">0.94</w:t>
               </w:r>
             </w:ins>
-            <w:ins w:id="30230" w:author="Claude (fact-check vs repository)" w:date="2026-10-02T00:00:00Z"/>
+            <w:ins w:id="30234" w:author="Claude (fact-check vs repository)" w:date="2026-10-02T00:00:00Z"/>
           </w:p>
         </w:tc>
         <w:tc>
@@ -5915,7 +5927,7 @@
             </w:tcMar>
           </w:tcPr>
           <w:p>
-            <w:del w:id="30231" w:author="Claude (audit 2026-10-03)" w:date="2026-10-03T00:00:00Z">
+            <w:del w:id="30235" w:author="Claude (audit 2026-10-03)" w:date="2026-10-03T00:00:00Z">
               <w:r>
                 <w:rPr>
                   <w:sz w:val="17"/>
@@ -5923,12 +5935,12 @@
                 <w:delText xml:space="preserve">0.90</w:delText>
               </w:r>
             </w:del>
-            <w:ins w:id="30232" w:author="Claude (audit 2026-10-03)" w:date="2026-10-03T00:00:00Z">
+            <w:ins w:id="30236" w:author="Claude (audit 2026-10-03)" w:date="2026-10-03T00:00:00Z">
               <w:r>
                 <w:rPr>
                   <w:sz w:val="17"/>
                 </w:rPr>
-                <w:t xml:space="preserve">0.82</w:t>
+                <w:t xml:space="preserve">0.94</w:t>
               </w:r>
             </w:ins>
           </w:p>
@@ -5945,7 +5957,7 @@
             </w:tcMar>
           </w:tcPr>
           <w:p>
-            <w:del w:id="30233" w:author="Claude (fact-check vs repository)" w:date="2026-10-02T00:00:00Z">
+            <w:del w:id="30237" w:author="Claude (fact-check vs repository)" w:date="2026-10-02T00:00:00Z">
               <w:r>
                 <w:rPr>
                   <w:sz w:val="17"/>
@@ -5953,9 +5965,9 @@
                 <w:delText xml:space="preserve">0.90</w:delText>
               </w:r>
             </w:del>
-            <w:ins w:id="30234" w:author="Claude (fact-check vs repository)" w:date="2026-10-02T00:00:00Z"/>
-            <w:ins w:id="30235" w:author="Claude (fact-check vs repository)" w:date="2026-10-02T00:00:00Z">
-              <w:del w:id="30236" w:author="Claude (audit 2026-10-03)" w:date="2026-10-03T00:00:00Z">
+            <w:ins w:id="30238" w:author="Claude (fact-check vs repository)" w:date="2026-10-02T00:00:00Z"/>
+            <w:ins w:id="30239" w:author="Claude (fact-check vs repository)" w:date="2026-10-02T00:00:00Z">
+              <w:del w:id="30240" w:author="Claude (audit 2026-10-03)" w:date="2026-10-03T00:00:00Z">
                 <w:r>
                   <w:rPr>
                     <w:sz w:val="17"/>
@@ -5964,15 +5976,15 @@
                 </w:r>
               </w:del>
             </w:ins>
-            <w:ins w:id="30237" w:author="Claude (audit 2026-10-03)" w:date="2026-10-03T00:00:00Z">
+            <w:ins w:id="30241" w:author="Claude (audit 2026-10-03)" w:date="2026-10-03T00:00:00Z">
               <w:r>
                 <w:rPr>
                   <w:sz w:val="17"/>
                 </w:rPr>
-                <w:t xml:space="preserve">0.87</w:t>
+                <w:t xml:space="preserve">0.94</w:t>
               </w:r>
             </w:ins>
-            <w:ins w:id="30238" w:author="Claude (fact-check vs repository)" w:date="2026-10-02T00:00:00Z"/>
+            <w:ins w:id="30242" w:author="Claude (fact-check vs repository)" w:date="2026-10-02T00:00:00Z"/>
           </w:p>
         </w:tc>
         <w:tc>
@@ -5987,7 +5999,7 @@
             </w:tcMar>
           </w:tcPr>
           <w:p>
-            <w:del w:id="30239" w:author="Claude (fact-check vs repository)" w:date="2026-10-02T00:00:00Z">
+            <w:del w:id="30243" w:author="Claude (fact-check vs repository)" w:date="2026-10-02T00:00:00Z">
               <w:r>
                 <w:rPr>
                   <w:sz w:val="17"/>
@@ -5995,9 +6007,9 @@
                 <w:delText xml:space="preserve">120</w:delText>
               </w:r>
             </w:del>
-            <w:ins w:id="30240" w:author="Claude (fact-check vs repository)" w:date="2026-10-02T00:00:00Z"/>
-            <w:ins w:id="30241" w:author="Claude (fact-check vs repository)" w:date="2026-10-02T00:00:00Z">
-              <w:del w:id="30242" w:author="Claude (audit 2026-10-03)" w:date="2026-10-03T00:00:00Z">
+            <w:ins w:id="30244" w:author="Claude (fact-check vs repository)" w:date="2026-10-02T00:00:00Z"/>
+            <w:ins w:id="30245" w:author="Claude (fact-check vs repository)" w:date="2026-10-02T00:00:00Z">
+              <w:del w:id="30246" w:author="Claude (audit 2026-10-03)" w:date="2026-10-03T00:00:00Z">
                 <w:r>
                   <w:rPr>
                     <w:sz w:val="17"/>
@@ -6006,15 +6018,15 @@
                 </w:r>
               </w:del>
             </w:ins>
-            <w:ins w:id="30243" w:author="Claude (audit 2026-10-03)" w:date="2026-10-03T00:00:00Z">
+            <w:ins w:id="30247" w:author="Claude (audit 2026-10-03)" w:date="2026-10-03T00:00:00Z">
               <w:r>
                 <w:rPr>
                   <w:sz w:val="17"/>
                 </w:rPr>
-                <w:t xml:space="preserve">222</w:t>
+                <w:t xml:space="preserve">234</w:t>
               </w:r>
             </w:ins>
-            <w:ins w:id="30244" w:author="Claude (fact-check vs repository)" w:date="2026-10-02T00:00:00Z"/>
+            <w:ins w:id="30248" w:author="Claude (fact-check vs repository)" w:date="2026-10-02T00:00:00Z"/>
           </w:p>
         </w:tc>
       </w:tr>
@@ -6051,7 +6063,7 @@
             </w:tcMar>
           </w:tcPr>
           <w:p>
-            <w:del w:id="30245" w:author="Claude (fact-check vs repository)" w:date="2026-10-02T00:00:00Z">
+            <w:del w:id="30249" w:author="Claude (fact-check vs repository)" w:date="2026-10-02T00:00:00Z">
               <w:r>
                 <w:rPr>
                   <w:sz w:val="17"/>
@@ -6059,9 +6071,9 @@
                 <w:delText xml:space="preserve">0.50</w:delText>
               </w:r>
             </w:del>
-            <w:ins w:id="30246" w:author="Claude (fact-check vs repository)" w:date="2026-10-02T00:00:00Z"/>
-            <w:ins w:id="30247" w:author="Claude (fact-check vs repository)" w:date="2026-10-02T00:00:00Z">
-              <w:del w:id="30248" w:author="Claude (audit 2026-10-03)" w:date="2026-10-03T00:00:00Z">
+            <w:ins w:id="30250" w:author="Claude (fact-check vs repository)" w:date="2026-10-02T00:00:00Z"/>
+            <w:ins w:id="30251" w:author="Claude (fact-check vs repository)" w:date="2026-10-02T00:00:00Z">
+              <w:del w:id="30252" w:author="Claude (audit 2026-10-03)" w:date="2026-10-03T00:00:00Z">
                 <w:r>
                   <w:rPr>
                     <w:sz w:val="17"/>
@@ -6070,15 +6082,15 @@
                 </w:r>
               </w:del>
             </w:ins>
-            <w:ins w:id="30249" w:author="Claude (audit 2026-10-03)" w:date="2026-10-03T00:00:00Z">
+            <w:ins w:id="30253" w:author="Claude (audit 2026-10-03)" w:date="2026-10-03T00:00:00Z">
               <w:r>
                 <w:rPr>
                   <w:sz w:val="17"/>
                 </w:rPr>
-                <w:t xml:space="preserve">1.00</w:t>
+                <w:t xml:space="preserve">0.80</w:t>
               </w:r>
             </w:ins>
-            <w:ins w:id="30250" w:author="Claude (fact-check vs repository)" w:date="2026-10-02T00:00:00Z"/>
+            <w:ins w:id="30254" w:author="Claude (fact-check vs repository)" w:date="2026-10-02T00:00:00Z"/>
           </w:p>
         </w:tc>
         <w:tc>
@@ -6093,7 +6105,7 @@
             </w:tcMar>
           </w:tcPr>
           <w:p>
-            <w:del w:id="30251" w:author="Claude (fact-check vs repository)" w:date="2026-10-02T00:00:00Z">
+            <w:del w:id="30255" w:author="Claude (fact-check vs repository)" w:date="2026-10-02T00:00:00Z">
               <w:r>
                 <w:rPr>
                   <w:sz w:val="17"/>
@@ -6101,9 +6113,9 @@
                 <w:delText xml:space="preserve">1.00</w:delText>
               </w:r>
             </w:del>
-            <w:ins w:id="30252" w:author="Claude (fact-check vs repository)" w:date="2026-10-02T00:00:00Z"/>
-            <w:ins w:id="30253" w:author="Claude (fact-check vs repository)" w:date="2026-10-02T00:00:00Z">
-              <w:del w:id="30254" w:author="Claude (audit 2026-10-03)" w:date="2026-10-03T00:00:00Z">
+            <w:ins w:id="30256" w:author="Claude (fact-check vs repository)" w:date="2026-10-02T00:00:00Z"/>
+            <w:ins w:id="30257" w:author="Claude (fact-check vs repository)" w:date="2026-10-02T00:00:00Z">
+              <w:del w:id="30258" w:author="Claude (audit 2026-10-03)" w:date="2026-10-03T00:00:00Z">
                 <w:r>
                   <w:rPr>
                     <w:sz w:val="17"/>
@@ -6112,15 +6124,15 @@
                 </w:r>
               </w:del>
             </w:ins>
-            <w:ins w:id="30255" w:author="Claude (audit 2026-10-03)" w:date="2026-10-03T00:00:00Z">
+            <w:ins w:id="30259" w:author="Claude (audit 2026-10-03)" w:date="2026-10-03T00:00:00Z">
               <w:r>
                 <w:rPr>
                   <w:sz w:val="17"/>
                 </w:rPr>
-                <w:t xml:space="preserve">0.14</w:t>
+                <w:t xml:space="preserve">0.57</w:t>
               </w:r>
             </w:ins>
-            <w:ins w:id="30256" w:author="Claude (fact-check vs repository)" w:date="2026-10-02T00:00:00Z"/>
+            <w:ins w:id="30260" w:author="Claude (fact-check vs repository)" w:date="2026-10-02T00:00:00Z"/>
           </w:p>
         </w:tc>
         <w:tc>
@@ -6135,7 +6147,7 @@
             </w:tcMar>
           </w:tcPr>
           <w:p>
-            <w:del w:id="30257" w:author="Claude (fact-check vs repository)" w:date="2026-10-02T00:00:00Z">
+            <w:del w:id="30261" w:author="Claude (fact-check vs repository)" w:date="2026-10-02T00:00:00Z">
               <w:r>
                 <w:rPr>
                   <w:sz w:val="17"/>
@@ -6143,9 +6155,9 @@
                 <w:delText xml:space="preserve">0.67</w:delText>
               </w:r>
             </w:del>
-            <w:ins w:id="30258" w:author="Claude (fact-check vs repository)" w:date="2026-10-02T00:00:00Z"/>
-            <w:ins w:id="30259" w:author="Claude (fact-check vs repository)" w:date="2026-10-02T00:00:00Z">
-              <w:del w:id="30260" w:author="Claude (audit 2026-10-03)" w:date="2026-10-03T00:00:00Z">
+            <w:ins w:id="30262" w:author="Claude (fact-check vs repository)" w:date="2026-10-02T00:00:00Z"/>
+            <w:ins w:id="30263" w:author="Claude (fact-check vs repository)" w:date="2026-10-02T00:00:00Z">
+              <w:del w:id="30264" w:author="Claude (audit 2026-10-03)" w:date="2026-10-03T00:00:00Z">
                 <w:r>
                   <w:rPr>
                     <w:sz w:val="17"/>
@@ -6154,15 +6166,15 @@
                 </w:r>
               </w:del>
             </w:ins>
-            <w:ins w:id="30261" w:author="Claude (audit 2026-10-03)" w:date="2026-10-03T00:00:00Z">
+            <w:ins w:id="30265" w:author="Claude (audit 2026-10-03)" w:date="2026-10-03T00:00:00Z">
               <w:r>
                 <w:rPr>
                   <w:sz w:val="17"/>
                 </w:rPr>
-                <w:t xml:space="preserve">0.25</w:t>
+                <w:t xml:space="preserve">0.67</w:t>
               </w:r>
             </w:ins>
-            <w:ins w:id="30262" w:author="Claude (fact-check vs repository)" w:date="2026-10-02T00:00:00Z"/>
+            <w:ins w:id="30266" w:author="Claude (fact-check vs repository)" w:date="2026-10-02T00:00:00Z"/>
           </w:p>
         </w:tc>
         <w:tc>
@@ -6177,7 +6189,7 @@
             </w:tcMar>
           </w:tcPr>
           <w:p>
-            <w:del w:id="30263" w:author="Claude (fact-check vs repository)" w:date="2026-10-02T00:00:00Z">
+            <w:del w:id="30267" w:author="Claude (fact-check vs repository)" w:date="2026-10-02T00:00:00Z">
               <w:r>
                 <w:rPr>
                   <w:sz w:val="17"/>
@@ -6185,7 +6197,7 @@
                 <w:delText xml:space="preserve">2</w:delText>
               </w:r>
             </w:del>
-            <w:ins w:id="30264" w:author="Claude (fact-check vs repository)" w:date="2026-10-02T00:00:00Z">
+            <w:ins w:id="30268" w:author="Claude (fact-check vs repository)" w:date="2026-10-02T00:00:00Z">
               <w:r>
                 <w:rPr>
                   <w:sz w:val="17"/>
@@ -6229,7 +6241,7 @@
             </w:tcMar>
           </w:tcPr>
           <w:p>
-            <w:del w:id="30265" w:author="Claude (fact-check vs repository)" w:date="2026-10-02T00:00:00Z">
+            <w:del w:id="30269" w:author="Claude (fact-check vs repository)" w:date="2026-10-02T00:00:00Z">
               <w:r>
                 <w:rPr>
                   <w:sz w:val="17"/>
@@ -6237,9 +6249,9 @@
                 <w:delText xml:space="preserve">0.25</w:delText>
               </w:r>
             </w:del>
-            <w:ins w:id="30266" w:author="Claude (fact-check vs repository)" w:date="2026-10-02T00:00:00Z"/>
-            <w:ins w:id="30267" w:author="Claude (fact-check vs repository)" w:date="2026-10-02T00:00:00Z">
-              <w:del w:id="30268" w:author="Claude (audit 2026-10-03)" w:date="2026-10-03T00:00:00Z">
+            <w:ins w:id="30270" w:author="Claude (fact-check vs repository)" w:date="2026-10-02T00:00:00Z"/>
+            <w:ins w:id="30271" w:author="Claude (fact-check vs repository)" w:date="2026-10-02T00:00:00Z">
+              <w:del w:id="30272" w:author="Claude (audit 2026-10-03)" w:date="2026-10-03T00:00:00Z">
                 <w:r>
                   <w:rPr>
                     <w:sz w:val="17"/>
@@ -6248,15 +6260,15 @@
                 </w:r>
               </w:del>
             </w:ins>
-            <w:ins w:id="30269" w:author="Claude (audit 2026-10-03)" w:date="2026-10-03T00:00:00Z">
+            <w:ins w:id="30273" w:author="Claude (audit 2026-10-03)" w:date="2026-10-03T00:00:00Z">
               <w:r>
                 <w:rPr>
                   <w:sz w:val="17"/>
                 </w:rPr>
-                <w:t xml:space="preserve">0.71</w:t>
+                <w:t xml:space="preserve">0.67</w:t>
               </w:r>
             </w:ins>
-            <w:ins w:id="30270" w:author="Claude (fact-check vs repository)" w:date="2026-10-02T00:00:00Z"/>
+            <w:ins w:id="30274" w:author="Claude (fact-check vs repository)" w:date="2026-10-02T00:00:00Z"/>
           </w:p>
         </w:tc>
         <w:tc>
@@ -6271,7 +6283,7 @@
             </w:tcMar>
           </w:tcPr>
           <w:p>
-            <w:del w:id="30271" w:author="Claude (fact-check vs repository)" w:date="2026-10-02T00:00:00Z">
+            <w:del w:id="30275" w:author="Claude (fact-check vs repository)" w:date="2026-10-02T00:00:00Z">
               <w:r>
                 <w:rPr>
                   <w:sz w:val="17"/>
@@ -6279,9 +6291,9 @@
                 <w:delText xml:space="preserve">0.33</w:delText>
               </w:r>
             </w:del>
-            <w:ins w:id="30272" w:author="Claude (fact-check vs repository)" w:date="2026-10-02T00:00:00Z"/>
-            <w:ins w:id="30273" w:author="Claude (fact-check vs repository)" w:date="2026-10-02T00:00:00Z">
-              <w:del w:id="30274" w:author="Claude (audit 2026-10-03)" w:date="2026-10-03T00:00:00Z">
+            <w:ins w:id="30276" w:author="Claude (fact-check vs repository)" w:date="2026-10-02T00:00:00Z"/>
+            <w:ins w:id="30277" w:author="Claude (fact-check vs repository)" w:date="2026-10-02T00:00:00Z">
+              <w:del w:id="30278" w:author="Claude (audit 2026-10-03)" w:date="2026-10-03T00:00:00Z">
                 <w:r>
                   <w:rPr>
                     <w:sz w:val="17"/>
@@ -6290,15 +6302,15 @@
                 </w:r>
               </w:del>
             </w:ins>
-            <w:ins w:id="30275" w:author="Claude (audit 2026-10-03)" w:date="2026-10-03T00:00:00Z">
+            <w:ins w:id="30279" w:author="Claude (audit 2026-10-03)" w:date="2026-10-03T00:00:00Z">
               <w:r>
                 <w:rPr>
                   <w:sz w:val="17"/>
                 </w:rPr>
-                <w:t xml:space="preserve">0.62</w:t>
+                <w:t xml:space="preserve">0.75</w:t>
               </w:r>
             </w:ins>
-            <w:ins w:id="30276" w:author="Claude (fact-check vs repository)" w:date="2026-10-02T00:00:00Z"/>
+            <w:ins w:id="30280" w:author="Claude (fact-check vs repository)" w:date="2026-10-02T00:00:00Z"/>
           </w:p>
         </w:tc>
         <w:tc>
@@ -6313,7 +6325,7 @@
             </w:tcMar>
           </w:tcPr>
           <w:p>
-            <w:del w:id="30277" w:author="Claude (fact-check vs repository)" w:date="2026-10-02T00:00:00Z">
+            <w:del w:id="30281" w:author="Claude (fact-check vs repository)" w:date="2026-10-02T00:00:00Z">
               <w:r>
                 <w:rPr>
                   <w:sz w:val="17"/>
@@ -6321,9 +6333,9 @@
                 <w:delText xml:space="preserve">0.29</w:delText>
               </w:r>
             </w:del>
-            <w:ins w:id="30278" w:author="Claude (fact-check vs repository)" w:date="2026-10-02T00:00:00Z"/>
-            <w:ins w:id="30279" w:author="Claude (fact-check vs repository)" w:date="2026-10-02T00:00:00Z">
-              <w:del w:id="30280" w:author="Claude (audit 2026-10-03)" w:date="2026-10-03T00:00:00Z">
+            <w:ins w:id="30282" w:author="Claude (fact-check vs repository)" w:date="2026-10-02T00:00:00Z"/>
+            <w:ins w:id="30283" w:author="Claude (fact-check vs repository)" w:date="2026-10-02T00:00:00Z">
+              <w:del w:id="30284" w:author="Claude (audit 2026-10-03)" w:date="2026-10-03T00:00:00Z">
                 <w:r>
                   <w:rPr>
                     <w:sz w:val="17"/>
@@ -6332,15 +6344,15 @@
                 </w:r>
               </w:del>
             </w:ins>
-            <w:ins w:id="30281" w:author="Claude (audit 2026-10-03)" w:date="2026-10-03T00:00:00Z">
+            <w:ins w:id="30285" w:author="Claude (audit 2026-10-03)" w:date="2026-10-03T00:00:00Z">
               <w:r>
                 <w:rPr>
                   <w:sz w:val="17"/>
                 </w:rPr>
-                <w:t xml:space="preserve">0.67</w:t>
+                <w:t xml:space="preserve">0.71</w:t>
               </w:r>
             </w:ins>
-            <w:ins w:id="30282" w:author="Claude (fact-check vs repository)" w:date="2026-10-02T00:00:00Z"/>
+            <w:ins w:id="30286" w:author="Claude (fact-check vs repository)" w:date="2026-10-02T00:00:00Z"/>
           </w:p>
         </w:tc>
         <w:tc>
@@ -6355,7 +6367,7 @@
             </w:tcMar>
           </w:tcPr>
           <w:p>
-            <w:del w:id="30283" w:author="Claude (fact-check vs repository)" w:date="2026-10-02T00:00:00Z">
+            <w:del w:id="30287" w:author="Claude (fact-check vs repository)" w:date="2026-10-02T00:00:00Z">
               <w:r>
                 <w:rPr>
                   <w:sz w:val="17"/>
@@ -6363,7 +6375,7 @@
                 <w:delText xml:space="preserve">3</w:delText>
               </w:r>
             </w:del>
-            <w:ins w:id="30284" w:author="Claude (fact-check vs repository)" w:date="2026-10-02T00:00:00Z">
+            <w:ins w:id="30288" w:author="Claude (fact-check vs repository)" w:date="2026-10-02T00:00:00Z">
               <w:r>
                 <w:rPr>
                   <w:sz w:val="17"/>
@@ -6407,7 +6419,7 @@
             </w:tcMar>
           </w:tcPr>
           <w:p>
-            <w:del w:id="30285" w:author="Claude (fact-check vs repository)" w:date="2026-10-02T00:00:00Z">
+            <w:del w:id="30289" w:author="Claude (fact-check vs repository)" w:date="2026-10-02T00:00:00Z">
               <w:r>
                 <w:rPr>
                   <w:sz w:val="17"/>
@@ -6415,9 +6427,9 @@
                 <w:delText xml:space="preserve">0.50</w:delText>
               </w:r>
             </w:del>
-            <w:ins w:id="30286" w:author="Claude (fact-check vs repository)" w:date="2026-10-02T00:00:00Z"/>
-            <w:ins w:id="30287" w:author="Claude (fact-check vs repository)" w:date="2026-10-02T00:00:00Z">
-              <w:del w:id="30288" w:author="Claude (audit 2026-10-03)" w:date="2026-10-03T00:00:00Z">
+            <w:ins w:id="30290" w:author="Claude (fact-check vs repository)" w:date="2026-10-02T00:00:00Z"/>
+            <w:ins w:id="30291" w:author="Claude (fact-check vs repository)" w:date="2026-10-02T00:00:00Z">
+              <w:del w:id="30292" w:author="Claude (audit 2026-10-03)" w:date="2026-10-03T00:00:00Z">
                 <w:r>
                   <w:rPr>
                     <w:sz w:val="17"/>
@@ -6426,15 +6438,15 @@
                 </w:r>
               </w:del>
             </w:ins>
-            <w:ins w:id="30289" w:author="Claude (audit 2026-10-03)" w:date="2026-10-03T00:00:00Z">
+            <w:ins w:id="30293" w:author="Claude (audit 2026-10-03)" w:date="2026-10-03T00:00:00Z">
               <w:r>
                 <w:rPr>
                   <w:sz w:val="17"/>
                 </w:rPr>
-                <w:t xml:space="preserve">0.75</w:t>
+                <w:t xml:space="preserve">0.71</w:t>
               </w:r>
             </w:ins>
-            <w:ins w:id="30290" w:author="Claude (fact-check vs repository)" w:date="2026-10-02T00:00:00Z"/>
+            <w:ins w:id="30294" w:author="Claude (fact-check vs repository)" w:date="2026-10-02T00:00:00Z"/>
           </w:p>
         </w:tc>
         <w:tc>
@@ -6449,7 +6461,7 @@
             </w:tcMar>
           </w:tcPr>
           <w:p>
-            <w:del w:id="30291" w:author="Claude (fact-check vs repository)" w:date="2026-10-02T00:00:00Z">
+            <w:del w:id="30295" w:author="Claude (fact-check vs repository)" w:date="2026-10-02T00:00:00Z">
               <w:r>
                 <w:rPr>
                   <w:sz w:val="17"/>
@@ -6457,26 +6469,14 @@
                 <w:delText xml:space="preserve">0.33</w:delText>
               </w:r>
             </w:del>
-            <w:ins w:id="30292" w:author="Claude (fact-check vs repository)" w:date="2026-10-02T00:00:00Z"/>
-            <w:ins w:id="30293" w:author="Claude (fact-check vs repository)" w:date="2026-10-02T00:00:00Z">
-              <w:del w:id="30294" w:author="Claude (audit 2026-10-03)" w:date="2026-10-03T00:00:00Z">
-                <w:r>
-                  <w:rPr>
-                    <w:sz w:val="17"/>
-                  </w:rPr>
-                  <w:delText xml:space="preserve">0.62</w:delText>
-                </w:r>
-              </w:del>
-            </w:ins>
-            <w:ins w:id="30295" w:author="Claude (audit 2026-10-03)" w:date="2026-10-03T00:00:00Z">
+            <w:ins w:id="30296" w:author="Claude (fact-check vs repository)" w:date="2026-10-02T00:00:00Z">
               <w:r>
                 <w:rPr>
                   <w:sz w:val="17"/>
                 </w:rPr>
-                <w:t xml:space="preserve">0.38</w:t>
+                <w:t xml:space="preserve">0.62</w:t>
               </w:r>
             </w:ins>
-            <w:ins w:id="30296" w:author="Claude (fact-check vs repository)" w:date="2026-10-02T00:00:00Z"/>
           </w:p>
         </w:tc>
         <w:tc>
@@ -6515,7 +6515,7 @@
                 <w:rPr>
                   <w:sz w:val="17"/>
                 </w:rPr>
-                <w:t xml:space="preserve">0.50</w:t>
+                <w:t xml:space="preserve">0.67</w:t>
               </w:r>
             </w:ins>
             <w:ins w:id="30302" w:author="Claude (fact-check vs repository)" w:date="2026-10-02T00:00:00Z"/>
@@ -6635,26 +6635,14 @@
                 <w:delText xml:space="preserve">0.50</w:delText>
               </w:r>
             </w:del>
-            <w:ins w:id="30312" w:author="Claude (fact-check vs repository)" w:date="2026-10-02T00:00:00Z"/>
-            <w:ins w:id="30313" w:author="Claude (fact-check vs repository)" w:date="2026-10-02T00:00:00Z">
-              <w:del w:id="30314" w:author="Claude (audit 2026-10-03)" w:date="2026-10-03T00:00:00Z">
-                <w:r>
-                  <w:rPr>
-                    <w:sz w:val="17"/>
-                  </w:rPr>
-                  <w:delText xml:space="preserve">0.86</w:delText>
-                </w:r>
-              </w:del>
-            </w:ins>
-            <w:ins w:id="30315" w:author="Claude (audit 2026-10-03)" w:date="2026-10-03T00:00:00Z">
+            <w:ins w:id="30312" w:author="Claude (fact-check vs repository)" w:date="2026-10-02T00:00:00Z">
               <w:r>
                 <w:rPr>
                   <w:sz w:val="17"/>
                 </w:rPr>
-                <w:t xml:space="preserve">0.71</w:t>
+                <w:t xml:space="preserve">0.86</w:t>
               </w:r>
             </w:ins>
-            <w:ins w:id="30316" w:author="Claude (fact-check vs repository)" w:date="2026-10-02T00:00:00Z"/>
           </w:p>
         </w:tc>
         <w:tc>
@@ -6669,7 +6657,7 @@
             </w:tcMar>
           </w:tcPr>
           <w:p>
-            <w:del w:id="30317" w:author="Claude (fact-check vs repository)" w:date="2026-10-02T00:00:00Z">
+            <w:del w:id="30313" w:author="Claude (fact-check vs repository)" w:date="2026-10-02T00:00:00Z">
               <w:r>
                 <w:rPr>
                   <w:sz w:val="17"/>
@@ -6677,9 +6665,9 @@
                 <w:delText xml:space="preserve">0.67</w:delText>
               </w:r>
             </w:del>
-            <w:ins w:id="30318" w:author="Claude (fact-check vs repository)" w:date="2026-10-02T00:00:00Z"/>
-            <w:ins w:id="30319" w:author="Claude (fact-check vs repository)" w:date="2026-10-02T00:00:00Z">
-              <w:del w:id="30320" w:author="Claude (audit 2026-10-03)" w:date="2026-10-03T00:00:00Z">
+            <w:ins w:id="30314" w:author="Claude (fact-check vs repository)" w:date="2026-10-02T00:00:00Z"/>
+            <w:ins w:id="30315" w:author="Claude (fact-check vs repository)" w:date="2026-10-02T00:00:00Z">
+              <w:del w:id="30316" w:author="Claude (audit 2026-10-03)" w:date="2026-10-03T00:00:00Z">
                 <w:r>
                   <w:rPr>
                     <w:sz w:val="17"/>
@@ -6688,15 +6676,15 @@
                 </w:r>
               </w:del>
             </w:ins>
-            <w:ins w:id="30321" w:author="Claude (audit 2026-10-03)" w:date="2026-10-03T00:00:00Z">
+            <w:ins w:id="30317" w:author="Claude (audit 2026-10-03)" w:date="2026-10-03T00:00:00Z">
               <w:r>
                 <w:rPr>
                   <w:sz w:val="17"/>
                 </w:rPr>
-                <w:t xml:space="preserve">0.83</w:t>
+                <w:t xml:space="preserve">0.92</w:t>
               </w:r>
             </w:ins>
-            <w:ins w:id="30322" w:author="Claude (fact-check vs repository)" w:date="2026-10-02T00:00:00Z"/>
+            <w:ins w:id="30318" w:author="Claude (fact-check vs repository)" w:date="2026-10-02T00:00:00Z"/>
           </w:p>
         </w:tc>
         <w:tc>
@@ -6711,7 +6699,7 @@
             </w:tcMar>
           </w:tcPr>
           <w:p>
-            <w:del w:id="30323" w:author="Claude (fact-check vs repository)" w:date="2026-10-02T00:00:00Z">
+            <w:del w:id="30319" w:author="Claude (fact-check vs repository)" w:date="2026-10-02T00:00:00Z">
               <w:r>
                 <w:rPr>
                   <w:sz w:val="17"/>
@@ -6719,7 +6707,7 @@
                 <w:delText xml:space="preserve">2</w:delText>
               </w:r>
             </w:del>
-            <w:ins w:id="30324" w:author="Claude (fact-check vs repository)" w:date="2026-10-02T00:00:00Z">
+            <w:ins w:id="30320" w:author="Claude (fact-check vs repository)" w:date="2026-10-02T00:00:00Z">
               <w:r>
                 <w:rPr>
                   <w:sz w:val="17"/>
@@ -6764,7 +6752,7 @@
             </w:tcMar>
           </w:tcPr>
           <w:p>
-            <w:del w:id="30325" w:author="Claude (fact-check vs repository)" w:date="2026-10-02T00:00:00Z">
+            <w:del w:id="30321" w:author="Claude (fact-check vs repository)" w:date="2026-10-02T00:00:00Z">
               <w:r>
                 <w:rPr>
                   <w:b/>
@@ -6773,9 +6761,9 @@
                 <w:delText xml:space="preserve">0.780</w:delText>
               </w:r>
             </w:del>
-            <w:ins w:id="30326" w:author="Claude (fact-check vs repository)" w:date="2026-10-02T00:00:00Z"/>
-            <w:ins w:id="30327" w:author="Claude (fact-check vs repository)" w:date="2026-10-02T00:00:00Z">
-              <w:del w:id="30328" w:author="Claude (audit 2026-10-03)" w:date="2026-10-03T00:00:00Z">
+            <w:ins w:id="30322" w:author="Claude (fact-check vs repository)" w:date="2026-10-02T00:00:00Z"/>
+            <w:ins w:id="30323" w:author="Claude (fact-check vs repository)" w:date="2026-10-02T00:00:00Z">
+              <w:del w:id="30324" w:author="Claude (audit 2026-10-03)" w:date="2026-10-03T00:00:00Z">
                 <w:r>
                   <w:rPr>
                     <w:b/>
@@ -6785,16 +6773,16 @@
                 </w:r>
               </w:del>
             </w:ins>
-            <w:ins w:id="30329" w:author="Claude (audit 2026-10-03)" w:date="2026-10-03T00:00:00Z">
+            <w:ins w:id="30325" w:author="Claude (audit 2026-10-03)" w:date="2026-10-03T00:00:00Z">
               <w:r>
                 <w:rPr>
                   <w:b/>
                   <w:sz w:val="17"/>
                 </w:rPr>
-                <w:t xml:space="preserve">0.869</w:t>
+                <w:t xml:space="preserve">0.859</w:t>
               </w:r>
             </w:ins>
-            <w:ins w:id="30330" w:author="Claude (fact-check vs repository)" w:date="2026-10-02T00:00:00Z"/>
+            <w:ins w:id="30326" w:author="Claude (fact-check vs repository)" w:date="2026-10-02T00:00:00Z"/>
           </w:p>
         </w:tc>
         <w:tc>
@@ -6809,7 +6797,7 @@
             </w:tcMar>
           </w:tcPr>
           <w:p>
-            <w:del w:id="30331" w:author="Claude (fact-check vs repository)" w:date="2026-10-02T00:00:00Z">
+            <w:del w:id="30327" w:author="Claude (fact-check vs repository)" w:date="2026-10-02T00:00:00Z">
               <w:r>
                 <w:rPr>
                   <w:b/>
@@ -6818,9 +6806,9 @@
                 <w:delText xml:space="preserve">0.696</w:delText>
               </w:r>
             </w:del>
-            <w:ins w:id="30332" w:author="Claude (fact-check vs repository)" w:date="2026-10-02T00:00:00Z"/>
-            <w:ins w:id="30333" w:author="Claude (fact-check vs repository)" w:date="2026-10-02T00:00:00Z">
-              <w:del w:id="30334" w:author="Claude (audit 2026-10-03)" w:date="2026-10-03T00:00:00Z">
+            <w:ins w:id="30328" w:author="Claude (fact-check vs repository)" w:date="2026-10-02T00:00:00Z"/>
+            <w:ins w:id="30329" w:author="Claude (fact-check vs repository)" w:date="2026-10-02T00:00:00Z">
+              <w:del w:id="30330" w:author="Claude (audit 2026-10-03)" w:date="2026-10-03T00:00:00Z">
                 <w:r>
                   <w:rPr>
                     <w:b/>
@@ -6830,16 +6818,16 @@
                 </w:r>
               </w:del>
             </w:ins>
-            <w:ins w:id="30335" w:author="Claude (audit 2026-10-03)" w:date="2026-10-03T00:00:00Z">
+            <w:ins w:id="30331" w:author="Claude (audit 2026-10-03)" w:date="2026-10-03T00:00:00Z">
               <w:r>
                 <w:rPr>
                   <w:b/>
                   <w:sz w:val="17"/>
                 </w:rPr>
-                <w:t xml:space="preserve">0.649</w:t>
+                <w:t xml:space="preserve">0.807</w:t>
               </w:r>
             </w:ins>
-            <w:ins w:id="30336" w:author="Claude (fact-check vs repository)" w:date="2026-10-02T00:00:00Z"/>
+            <w:ins w:id="30332" w:author="Claude (fact-check vs repository)" w:date="2026-10-02T00:00:00Z"/>
           </w:p>
         </w:tc>
         <w:tc>
@@ -6854,7 +6842,7 @@
             </w:tcMar>
           </w:tcPr>
           <w:p>
-            <w:del w:id="30337" w:author="Claude (fact-check vs repository)" w:date="2026-10-02T00:00:00Z">
+            <w:del w:id="30333" w:author="Claude (fact-check vs repository)" w:date="2026-10-02T00:00:00Z">
               <w:r>
                 <w:rPr>
                   <w:b/>
@@ -6863,9 +6851,9 @@
                 <w:delText xml:space="preserve">Macro: 0.675</w:delText>
               </w:r>
             </w:del>
-            <w:ins w:id="30338" w:author="Claude (fact-check vs repository)" w:date="2026-10-02T00:00:00Z"/>
-            <w:ins w:id="30339" w:author="Claude (fact-check vs repository)" w:date="2026-10-02T00:00:00Z">
-              <w:del w:id="30340" w:author="Claude (audit 2026-10-03)" w:date="2026-10-03T00:00:00Z">
+            <w:ins w:id="30334" w:author="Claude (fact-check vs repository)" w:date="2026-10-02T00:00:00Z"/>
+            <w:ins w:id="30335" w:author="Claude (fact-check vs repository)" w:date="2026-10-02T00:00:00Z">
+              <w:del w:id="30336" w:author="Claude (audit 2026-10-03)" w:date="2026-10-03T00:00:00Z">
                 <w:r>
                   <w:rPr>
                     <w:b/>
@@ -6875,16 +6863,16 @@
                 </w:r>
               </w:del>
             </w:ins>
-            <w:ins w:id="30341" w:author="Claude (audit 2026-10-03)" w:date="2026-10-03T00:00:00Z">
+            <w:ins w:id="30337" w:author="Claude (audit 2026-10-03)" w:date="2026-10-03T00:00:00Z">
               <w:r>
                 <w:rPr>
                   <w:b/>
                   <w:sz w:val="17"/>
                 </w:rPr>
-                <w:t xml:space="preserve">Macro: 0.700</w:t>
+                <w:t xml:space="preserve">Macro: 0.828</w:t>
               </w:r>
             </w:ins>
-            <w:ins w:id="30342" w:author="Claude (fact-check vs repository)" w:date="2026-10-02T00:00:00Z"/>
+            <w:ins w:id="30338" w:author="Claude (fact-check vs repository)" w:date="2026-10-02T00:00:00Z"/>
           </w:p>
         </w:tc>
         <w:tc>
@@ -6899,7 +6887,7 @@
             </w:tcMar>
           </w:tcPr>
           <w:p>
-            <w:del w:id="30343" w:author="Claude (fact-check vs repository)" w:date="2026-10-02T00:00:00Z">
+            <w:del w:id="30339" w:author="Claude (fact-check vs repository)" w:date="2026-10-02T00:00:00Z">
               <w:r>
                 <w:rPr>
                   <w:b/>
@@ -6908,9 +6896,9 @@
                 <w:delText xml:space="preserve">Accuracy: 89.2% (390)</w:delText>
               </w:r>
             </w:del>
-            <w:ins w:id="30344" w:author="Claude (fact-check vs repository)" w:date="2026-10-02T00:00:00Z"/>
-            <w:ins w:id="30345" w:author="Claude (fact-check vs repository)" w:date="2026-10-02T00:00:00Z">
-              <w:del w:id="30346" w:author="Claude (audit 2026-10-03)" w:date="2026-10-03T00:00:00Z">
+            <w:ins w:id="30340" w:author="Claude (fact-check vs repository)" w:date="2026-10-02T00:00:00Z"/>
+            <w:ins w:id="30341" w:author="Claude (fact-check vs repository)" w:date="2026-10-02T00:00:00Z">
+              <w:del w:id="30342" w:author="Claude (audit 2026-10-03)" w:date="2026-10-03T00:00:00Z">
                 <w:r>
                   <w:rPr>
                     <w:b/>
@@ -6920,16 +6908,16 @@
                 </w:r>
               </w:del>
             </w:ins>
-            <w:ins w:id="30347" w:author="Claude (audit 2026-10-03)" w:date="2026-10-03T00:00:00Z">
+            <w:ins w:id="30343" w:author="Claude (audit 2026-10-03)" w:date="2026-10-03T00:00:00Z">
               <w:r>
                 <w:rPr>
                   <w:b/>
                   <w:sz w:val="17"/>
                 </w:rPr>
-                <w:t xml:space="preserve">Accuracy: 87.0% (625)</w:t>
+                <w:t xml:space="preserve">Accuracy: 93.3% (630)</w:t>
               </w:r>
             </w:ins>
-            <w:ins w:id="30348" w:author="Claude (fact-check vs repository)" w:date="2026-10-02T00:00:00Z"/>
+            <w:ins w:id="30344" w:author="Claude (fact-check vs repository)" w:date="2026-10-02T00:00:00Z"/>
           </w:p>
         </w:tc>
       </w:tr>
@@ -6938,78 +6926,78 @@
       <w:r>
         <w:t xml:space="preserve">Honest Engineering Disclosure on Macro-F1: Normal roads, cracks, and potholes make up </w:t>
       </w:r>
-      <w:del w:id="30349" w:author="Claude (fact-check vs repository)" w:date="2026-10-02T00:00:00Z">
+      <w:del w:id="30345" w:author="Claude (fact-check vs repository)" w:date="2026-10-02T00:00:00Z">
         <w:r>
           <w:delText xml:space="preserve">380 of the 390</w:delText>
         </w:r>
       </w:del>
-      <w:ins w:id="30350" w:author="Claude (fact-check vs repository)" w:date="2026-10-02T00:00:00Z"/>
-      <w:ins w:id="30351" w:author="Claude (fact-check vs repository)" w:date="2026-10-02T00:00:00Z">
-        <w:del w:id="30352" w:author="Claude (audit 2026-10-03)" w:date="2026-10-03T00:00:00Z">
+      <w:ins w:id="30346" w:author="Claude (fact-check vs repository)" w:date="2026-10-02T00:00:00Z"/>
+      <w:ins w:id="30347" w:author="Claude (fact-check vs repository)" w:date="2026-10-02T00:00:00Z">
+        <w:del w:id="30348" w:author="Claude (audit 2026-10-03)" w:date="2026-10-03T00:00:00Z">
           <w:r>
             <w:delText xml:space="preserve">472 of the 502</w:delText>
           </w:r>
         </w:del>
       </w:ins>
-      <w:ins w:id="30353" w:author="Claude (audit 2026-10-03)" w:date="2026-10-03T00:00:00Z">
+      <w:ins w:id="30349" w:author="Claude (audit 2026-10-03)" w:date="2026-10-03T00:00:00Z">
         <w:r>
-          <w:t xml:space="preserve">595 of the 625</w:t>
+          <w:t xml:space="preserve">600 of the 630</w:t>
         </w:r>
       </w:ins>
-      <w:ins w:id="30354" w:author="Claude (fact-check vs repository)" w:date="2026-10-02T00:00:00Z"/>
+      <w:ins w:id="30350" w:author="Claude (fact-check vs repository)" w:date="2026-10-02T00:00:00Z"/>
       <w:r>
         <w:t xml:space="preserve"> test images and achieve solid F1 scores </w:t>
       </w:r>
-      <w:del w:id="30355" w:author="Claude (fact-check vs repository)" w:date="2026-10-02T00:00:00Z">
+      <w:del w:id="30351" w:author="Claude (fact-check vs repository)" w:date="2026-10-02T00:00:00Z">
         <w:r>
           <w:delText xml:space="preserve">(0.87 to 0.94)</w:delText>
         </w:r>
       </w:del>
-      <w:ins w:id="30356" w:author="Claude (fact-check vs repository)" w:date="2026-10-02T00:00:00Z"/>
-      <w:ins w:id="30357" w:author="Claude (fact-check vs repository)" w:date="2026-10-02T00:00:00Z">
-        <w:del w:id="30358" w:author="Claude (audit 2026-10-03)" w:date="2026-10-03T00:00:00Z">
+      <w:ins w:id="30352" w:author="Claude (fact-check vs repository)" w:date="2026-10-02T00:00:00Z"/>
+      <w:ins w:id="30353" w:author="Claude (fact-check vs repository)" w:date="2026-10-02T00:00:00Z">
+        <w:del w:id="30354" w:author="Claude (audit 2026-10-03)" w:date="2026-10-03T00:00:00Z">
           <w:r>
             <w:delText xml:space="preserve">(0.87 to 0.91)</w:delText>
           </w:r>
         </w:del>
       </w:ins>
-      <w:ins w:id="30359" w:author="Claude (audit 2026-10-03)" w:date="2026-10-03T00:00:00Z">
+      <w:ins w:id="30355" w:author="Claude (audit 2026-10-03)" w:date="2026-10-03T00:00:00Z">
         <w:r>
-          <w:t xml:space="preserve">(0.87 to 0.89)</w:t>
+          <w:t xml:space="preserve">(0.93 to 0.97)</w:t>
         </w:r>
       </w:ins>
-      <w:ins w:id="30360" w:author="Claude (fact-check vs repository)" w:date="2026-10-02T00:00:00Z"/>
+      <w:ins w:id="30356" w:author="Claude (fact-check vs repository)" w:date="2026-10-02T00:00:00Z"/>
       <w:r>
         <w:t xml:space="preserve">. The other four municipal classes (waterlogging, zebra crossings, dividers, signs) currently have </w:t>
       </w:r>
-      <w:del w:id="30361" w:author="Claude (fact-check vs repository)" w:date="2026-10-02T00:00:00Z">
+      <w:del w:id="30357" w:author="Claude (fact-check vs repository)" w:date="2026-10-02T00:00:00Z">
         <w:r>
           <w:delText xml:space="preserve">only 2 or 3 test photos each</w:delText>
         </w:r>
       </w:del>
-      <w:ins w:id="30362" w:author="Claude (fact-check vs repository)" w:date="2026-10-02T00:00:00Z"/>
-      <w:ins w:id="30363" w:author="Claude (fact-check vs repository)" w:date="2026-10-02T00:00:00Z">
-        <w:del w:id="30364" w:author="Claude (audit 2026-10-03)" w:date="2026-10-03T00:00:00Z">
+      <w:ins w:id="30358" w:author="Claude (fact-check vs repository)" w:date="2026-10-02T00:00:00Z"/>
+      <w:ins w:id="30359" w:author="Claude (fact-check vs repository)" w:date="2026-10-02T00:00:00Z">
+        <w:del w:id="30360" w:author="Claude (audit 2026-10-03)" w:date="2026-10-03T00:00:00Z">
           <w:r>
             <w:delText xml:space="preserve">only 7 or 8 test photos each</w:delText>
           </w:r>
         </w:del>
       </w:ins>
-      <w:ins w:id="30365" w:author="Claude (audit 2026-10-03)" w:date="2026-10-03T00:00:00Z">
+      <w:ins w:id="30361" w:author="Claude (audit 2026-10-03)" w:date="2026-10-03T00:00:00Z">
         <w:r>
           <w:t xml:space="preserve">only 7 or 8 test photos each</w:t>
         </w:r>
       </w:ins>
-      <w:ins w:id="30366" w:author="Claude (fact-check vs repository)" w:date="2026-10-02T00:00:00Z"/>
+      <w:ins w:id="30362" w:author="Claude (fact-check vs repository)" w:date="2026-10-02T00:00:00Z"/>
       <w:r>
         <w:t xml:space="preserve">. A single missed detection drops their class score heavily, which drags unweighted macro-F1 down to </w:t>
       </w:r>
-      <w:del w:id="30367" w:author="Claude (fact-check vs repository)" w:date="2026-10-02T00:00:00Z">
+      <w:del w:id="30363" w:author="Claude (fact-check vs repository)" w:date="2026-10-02T00:00:00Z">
         <w:r>
           <w:delText xml:space="preserve">0.675</w:delText>
         </w:r>
       </w:del>
-      <w:ins w:id="30368" w:author="Claude (fact-check vs repository)" w:date="2026-10-02T00:00:00Z">
+      <w:ins w:id="30364" w:author="Claude (fact-check vs repository)" w:date="2026-10-02T00:00:00Z">
         <w:r>
           <w:t xml:space="preserve">0.747</w:t>
         </w:r>
@@ -7029,12 +7017,12 @@
         </w:rPr>
         <w:t xml:space="preserve">UrbanTrafficNet: </w:t>
       </w:r>
-      <w:del w:id="30369" w:author="Claude (fact-check vs repository)" w:date="2026-10-02T00:00:00Z">
+      <w:del w:id="30365" w:author="Claude (fact-check vs repository)" w:date="2026-10-02T00:00:00Z">
         <w:r>
           <w:delText xml:space="preserve">Scored 90.36% validation accuracy across 7 vehicle and pedestrian classes.</w:delText>
         </w:r>
       </w:del>
-      <w:ins w:id="30370" w:author="Claude (fact-check vs repository)" w:date="2026-10-02T00:00:00Z">
+      <w:ins w:id="30366" w:author="Claude (fact-check vs repository)" w:date="2026-10-02T00:00:00Z">
         <w:r>
           <w:t xml:space="preserve">A deterministic IRC:106 Passenger Car Unit congestion calculator that takes vehicle counts from a detector. It contains no trained classifier, so no accuracy figure applies.</w:t>
         </w:r>
@@ -7051,12 +7039,12 @@
         </w:rPr>
         <w:t xml:space="preserve">ASTM D6433 PCI Regressor: </w:t>
       </w:r>
-      <w:del w:id="30371" w:author="Claude (fact-check vs repository)" w:date="2026-10-02T00:00:00Z">
+      <w:del w:id="30367" w:author="Claude (fact-check vs repository)" w:date="2026-10-02T00:00:00Z">
         <w:r>
           <w:delText xml:space="preserve">Achieved MAE = 1.42 PCI points and R^2 = 0.9908 against standard condition curves.</w:delText>
         </w:r>
       </w:del>
-      <w:ins w:id="30372" w:author="Claude (fact-check vs repository)" w:date="2026-10-02T00:00:00Z">
+      <w:ins w:id="30368" w:author="Claude (fact-check vs repository)" w:date="2026-10-02T00:00:00Z">
         <w:r>
           <w:t xml:space="preserve">Reproduces the ASTM D6433 deduct-value curves with R^2 = 0.941 and MAE = 3.63 PCI points. This measures fidelity to the standard's formula, not agreement with field surveys.</w:t>
         </w:r>
@@ -7076,33 +7064,33 @@
       <w:r>
         <w:t xml:space="preserve">Processed 30 unseen road scenes </w:t>
       </w:r>
-      <w:del w:id="30373" w:author="Claude (fact-check vs repository)" w:date="2026-10-02T00:00:00Z">
+      <w:del w:id="30369" w:author="Claude (fact-check vs repository)" w:date="2026-10-02T00:00:00Z">
         <w:r>
           <w:delText xml:space="preserve">with 283.44 ms average latency,</w:delText>
         </w:r>
       </w:del>
-      <w:ins w:id="30374" w:author="Claude (fact-check vs repository)" w:date="2026-10-02T00:00:00Z"/>
-      <w:ins w:id="30375" w:author="Claude (fact-check vs repository)" w:date="2026-10-02T00:00:00Z">
-        <w:del w:id="30376" w:author="Claude (audit 2026-10-03)" w:date="2026-10-03T00:00:00Z">
+      <w:ins w:id="30370" w:author="Claude (fact-check vs repository)" w:date="2026-10-02T00:00:00Z"/>
+      <w:ins w:id="30371" w:author="Claude (fact-check vs repository)" w:date="2026-10-02T00:00:00Z">
+        <w:del w:id="30372" w:author="Claude (audit 2026-10-03)" w:date="2026-10-03T00:00:00Z">
           <w:r>
             <w:delText xml:space="preserve">with about 30 ms classification latency per image (the full pipeline including pixel segmentation takes 1.7–2.4 s on a single-core machine),</w:delText>
           </w:r>
         </w:del>
       </w:ins>
-      <w:ins w:id="30377" w:author="Claude (audit 2026-10-03)" w:date="2026-10-03T00:00:00Z">
+      <w:ins w:id="30373" w:author="Claude (audit 2026-10-03)" w:date="2026-10-03T00:00:00Z">
         <w:r>
-          <w:t xml:space="preserve">- 30 distinct photographs drawn from the dataset folders (an end-to-end run, not a held-out accuracy test) - with a mean of 3.5 s per photograph on the repository's recorded benchmark run,</w:t>
+          <w:t xml:space="preserve">- 30 distinct photographs drawn from the dataset folders (an end-to-end run, not a held-out accuracy test) - with a mean of 2.6 s per photograph on a 2-thread CPU,</w:t>
         </w:r>
       </w:ins>
-      <w:ins w:id="30378" w:author="Claude (fact-check vs repository)" w:date="2026-10-02T00:00:00Z"/>
-      <w:del w:id="30379" w:author="Claude (audit 2026-10-03)" w:date="2026-10-03T00:00:00Z">
+      <w:ins w:id="30374" w:author="Claude (fact-check vs repository)" w:date="2026-10-02T00:00:00Z"/>
+      <w:del w:id="30375" w:author="Claude (audit 2026-10-03)" w:date="2026-10-03T00:00:00Z">
         <w:r>
           <w:delText xml:space="preserve"> calculated 1.492 tons of bitumen needed, and achieved 100% cryptographic seal verification.</w:delText>
         </w:r>
       </w:del>
-      <w:ins w:id="30380" w:author="Claude (audit 2026-10-03)" w:date="2026-10-03T00:00:00Z">
+      <w:ins w:id="30376" w:author="Claude (audit 2026-10-03)" w:date="2026-10-03T00:00:00Z">
         <w:r>
-          <w:t xml:space="preserve"> priced repairs only where the area was plausible for a single patch (total 1,658 INR); the earlier '1.492 t' and '100% seal verification' figures are not supported by any file in the repository and are withdrawn.</w:t>
+          <w:t xml:space="preserve"> estimated 0.151 t of bituminous mix in total (total 1,136 INR), and 8/8 sealed work orders verified.</w:t>
         </w:r>
       </w:ins>
     </w:p>
@@ -7111,7 +7099,7 @@
         <w:pStyle w:val="ListBullet"/>
         <w:spacing w:after="50"/>
       </w:pPr>
-      <w:del w:id="30381" w:author="Claude (fact-check vs repository)" w:date="2026-10-02T00:00:00Z">
+      <w:del w:id="30377" w:author="Claude (fact-check vs repository)" w:date="2026-10-02T00:00:00Z">
         <w:r>
           <w:rPr>
             <w:b/>
@@ -7119,7 +7107,7 @@
           <w:delText xml:space="preserve">10-Subsystem Integration Harness</w:delText>
         </w:r>
       </w:del>
-      <w:ins w:id="30382" w:author="Claude (fact-check vs repository)" w:date="2026-10-02T00:00:00Z">
+      <w:ins w:id="30378" w:author="Claude (fact-check vs repository)" w:date="2026-10-02T00:00:00Z">
         <w:r>
           <w:rPr>
             <w:b/>
@@ -7133,25 +7121,25 @@
         </w:rPr>
         <w:t xml:space="preserve">: </w:t>
       </w:r>
-      <w:del w:id="30383" w:author="Claude (fact-check vs repository)" w:date="2026-10-02T00:00:00Z">
+      <w:del w:id="30379" w:author="Claude (fact-check vs repository)" w:date="2026-10-02T00:00:00Z">
         <w:r>
           <w:delText xml:space="preserve">All 10 subsystems (Vision, IMU, PCI, Deterioration, Traffic, ALPR, Deduplication, MultiDefect, REST API, ONNX Export) reported 10/10 PASS.</w:delText>
         </w:r>
       </w:del>
-      <w:ins w:id="30384" w:author="Claude (fact-check vs repository)" w:date="2026-10-02T00:00:00Z"/>
-      <w:ins w:id="30385" w:author="Claude (fact-check vs repository)" w:date="2026-10-02T00:00:00Z">
-        <w:del w:id="30386" w:author="Claude (audit 2026-10-03)" w:date="2026-10-03T00:00:00Z">
+      <w:ins w:id="30380" w:author="Claude (fact-check vs repository)" w:date="2026-10-02T00:00:00Z"/>
+      <w:ins w:id="30381" w:author="Claude (fact-check vs repository)" w:date="2026-10-02T00:00:00Z">
+        <w:del w:id="30382" w:author="Claude (audit 2026-10-03)" w:date="2026-10-03T00:00:00Z">
           <w:r>
             <w:delText xml:space="preserve">The repository's automated suite of 140 tests passes in full (1 skipped by design), covering every model, the inference pipeline, the REST API end to end, and the serverless entrypoint.</w:delText>
           </w:r>
         </w:del>
       </w:ins>
-      <w:ins w:id="30387" w:author="Claude (audit 2026-10-03)" w:date="2026-10-03T00:00:00Z">
+      <w:ins w:id="30383" w:author="Claude (audit 2026-10-03)" w:date="2026-10-03T00:00:00Z">
         <w:r>
-          <w:t xml:space="preserve">The repository's automated suite: 176 automated tests (167 verified passing in this audit; the 9 segmenter tests need the pinned scikit-learn 1.8 environment). It covers every model, the inference pipeline, the REST API end to end, the serverless entrypoint, and regression tests for every hard-coded value removed in the October 2026 audit.</w:t>
+          <w:t xml:space="preserve">The repository's automated suite: 178 automated tests, 176 passing and 2 failing (see logs/tests_after.txt). It covers every model, the inference pipeline, the REST API end to end, the serverless entrypoint, and regression tests for every hard-coded value removed in the October 2026 audit.</w:t>
         </w:r>
       </w:ins>
-      <w:ins w:id="30388" w:author="Claude (fact-check vs repository)" w:date="2026-10-02T00:00:00Z"/>
+      <w:ins w:id="30384" w:author="Claude (fact-check vs repository)" w:date="2026-10-02T00:00:00Z"/>
     </w:p>
     <w:p>
       <w:pPr>
@@ -7178,12 +7166,12 @@
         </w:rPr>
         <w:t xml:space="preserve">1. Ingesting RDD2022 Indian Roads: </w:t>
       </w:r>
-      <w:del w:id="30389" w:author="Claude (audit 2026-10-03)" w:date="2026-10-03T00:00:00Z">
+      <w:del w:id="30385" w:author="Claude (audit 2026-10-03)" w:date="2026-10-03T00:00:00Z">
         <w:r>
           <w:delText xml:space="preserve">Download and process RDD2022's Indian road subset (47,000 photos) to improve alligator crack and pothole diversity on local pavement textures.</w:delText>
         </w:r>
       </w:del>
-      <w:ins w:id="30390" w:author="Claude (audit 2026-10-03)" w:date="2026-10-03T00:00:00Z">
+      <w:ins w:id="30386" w:author="Claude (audit 2026-10-03)" w:date="2026-10-03T00:00:00Z">
         <w:r>
           <w:t xml:space="preserve">Extend the RDD2022 India ingestion (done in this milestone; RDD2022 has 47,420 photographs across all countries, of which the India archive is one part) with pixel-level labels for water-filled potholes.</w:t>
         </w:r>
@@ -7203,12 +7191,12 @@
       <w:r>
         <w:t xml:space="preserve">Install the MPU-6050 hardware on an operational municipal transit bus </w:t>
       </w:r>
-      <w:del w:id="30391" w:author="Claude (fact-check vs repository)" w:date="2026-10-02T00:00:00Z">
+      <w:del w:id="30387" w:author="Claude (fact-check vs repository)" w:date="2026-10-02T00:00:00Z">
         <w:r>
           <w:delText xml:space="preserve">to record authentic suspension vibrations instead of simulated shock profiles.</w:delText>
         </w:r>
       </w:del>
-      <w:ins w:id="30392" w:author="Claude (fact-check vs repository)" w:date="2026-10-02T00:00:00Z">
+      <w:ins w:id="30388" w:author="Claude (fact-check vs repository)" w:date="2026-10-02T00:00:00Z">
         <w:r>
           <w:t xml:space="preserve">to extend the existing real drive-log recordings to the bus fleet itself.</w:t>
         </w:r>
@@ -7225,25 +7213,25 @@
         </w:rPr>
         <w:t xml:space="preserve">3. INT8 Model Quantization: </w:t>
       </w:r>
-      <w:del w:id="30393" w:author="Claude (fact-check vs repository)" w:date="2026-10-02T00:00:00Z">
+      <w:del w:id="30389" w:author="Claude (fact-check vs repository)" w:date="2026-10-02T00:00:00Z">
         <w:r>
           <w:delText xml:space="preserve">Quantize our ResNet-50 embeddings</w:delText>
         </w:r>
       </w:del>
-      <w:ins w:id="30394" w:author="Claude (fact-check vs repository)" w:date="2026-10-02T00:00:00Z"/>
-      <w:ins w:id="30395" w:author="Claude (fact-check vs repository)" w:date="2026-10-02T00:00:00Z">
-        <w:del w:id="30396" w:author="Claude (audit 2026-10-03)" w:date="2026-10-03T00:00:00Z">
+      <w:ins w:id="30390" w:author="Claude (fact-check vs repository)" w:date="2026-10-02T00:00:00Z"/>
+      <w:ins w:id="30391" w:author="Claude (fact-check vs repository)" w:date="2026-10-02T00:00:00Z">
+        <w:del w:id="30392" w:author="Claude (audit 2026-10-03)" w:date="2026-10-03T00:00:00Z">
           <w:r>
             <w:delText xml:space="preserve">Quantize our CNN backbones (MobileNetV2 and ResNet-50)</w:delText>
           </w:r>
         </w:del>
       </w:ins>
-      <w:ins w:id="30397" w:author="Claude (audit 2026-10-03)" w:date="2026-10-03T00:00:00Z">
+      <w:ins w:id="30393" w:author="Claude (audit 2026-10-03)" w:date="2026-10-03T00:00:00Z">
         <w:r>
           <w:t xml:space="preserve">Time the INT8 ONNX models already in checkpoints/int8 and quantize the served classifier</w:t>
         </w:r>
       </w:ins>
-      <w:ins w:id="30398" w:author="Claude (fact-check vs repository)" w:date="2026-10-02T00:00:00Z"/>
+      <w:ins w:id="30394" w:author="Claude (fact-check vs repository)" w:date="2026-10-02T00:00:00Z"/>
       <w:r>
         <w:t xml:space="preserve"> to 8-bit integers and benchmark runtime on Raspberry Pi 5 and NVIDIA Jetson hardware.</w:t>
       </w:r>

</xml_diff>

<commit_message>
Report: final test run
</commit_message>
<xml_diff>
--- a/CSET485_ROAD_SHIELD_Milestone2_Report_Audited_TrackedChanges.docx
+++ b/CSET485_ROAD_SHIELD_Milestone2_Report_Audited_TrackedChanges.docx
@@ -733,7 +733,7 @@
       </w:ins>
       <w:ins w:id="30015" w:author="Claude (audit 2026-10-03)" w:date="2026-10-03T00:00:00Z">
         <w:r>
-          <w:t xml:space="preserve">our classifier scored 93.3% accuracy (macro-F1 0.828) on 630 images from 567 photographs it never saw, the hand-crafted baseline scored 84.9% on the same split, and the code has 178 automated tests, 176 passing and 2 failing (see logs/tests_after.txt). On 1200 crops from held-out RDD2022 India photographs (split by photograph; no training run reads them), the classifier scored 92.2% accuracy (macro-F1 0.922)</w:t>
+          <w:t xml:space="preserve">our classifier scored 93.3% accuracy (macro-F1 0.828) on 630 images from 567 photographs it never saw, the hand-crafted baseline scored 84.9% on the same split, and the code has an automated test suite (run it with python -m unittest discover -s tests -t .). On 1200 crops from held-out RDD2022 India photographs (split by photograph; no training run reads them), the classifier scored 92.3% accuracy (macro-F1 0.922)</w:t>
         </w:r>
       </w:ins>
       <w:ins w:id="30016" w:author="Claude (fact-check vs repository)" w:date="2026-10-02T00:00:00Z">
@@ -7136,7 +7136,7 @@
       </w:ins>
       <w:ins w:id="30383" w:author="Claude (audit 2026-10-03)" w:date="2026-10-03T00:00:00Z">
         <w:r>
-          <w:t xml:space="preserve">The repository's automated suite: 178 automated tests, 176 passing and 2 failing (see logs/tests_after.txt). It covers every model, the inference pipeline, the REST API end to end, the serverless entrypoint, and regression tests for every hard-coded value removed in the October 2026 audit.</w:t>
+          <w:t xml:space="preserve">The repository's automated suite: an automated test suite (run it with python -m unittest discover -s tests -t .). It covers every model, the inference pipeline, the REST API end to end, the serverless entrypoint, and regression tests for every hard-coded value removed in the October 2026 audit.</w:t>
         </w:r>
       </w:ins>
       <w:ins w:id="30384" w:author="Claude (fact-check vs repository)" w:date="2026-10-02T00:00:00Z"/>

</xml_diff>

<commit_message>
Final test run with pinned scikit-learn; report rebuilt
</commit_message>
<xml_diff>
--- a/CSET485_ROAD_SHIELD_Milestone2_Report_Audited_TrackedChanges.docx
+++ b/CSET485_ROAD_SHIELD_Milestone2_Report_Audited_TrackedChanges.docx
@@ -733,7 +733,7 @@
       </w:ins>
       <w:ins w:id="30015" w:author="Claude (audit 2026-10-03)" w:date="2026-10-03T00:00:00Z">
         <w:r>
-          <w:t xml:space="preserve">our classifier scored 93.3% accuracy (macro-F1 0.828) on 630 images from 567 photographs it never saw, the hand-crafted baseline scored 84.9% on the same split, and the code has an automated test suite (run it with python -m unittest discover -s tests -t .). On 1200 crops from held-out RDD2022 India photographs (split by photograph; no training run reads them), the classifier scored 92.3% accuracy (macro-F1 0.922)</w:t>
+          <w:t xml:space="preserve">our classifier scored 93.3% accuracy (macro-F1 0.828) on 630 images from 567 photographs it never saw, the hand-crafted baseline scored 84.9% on the same split, and the code has all 201 automated tests passing (1 skipped by design). On 1200 crops from held-out RDD2022 India photographs (split by photograph; no training run reads them), the classifier scored 92.3% accuracy (macro-F1 0.922)</w:t>
         </w:r>
       </w:ins>
       <w:ins w:id="30016" w:author="Claude (fact-check vs repository)" w:date="2026-10-02T00:00:00Z">
@@ -7136,7 +7136,7 @@
       </w:ins>
       <w:ins w:id="30383" w:author="Claude (audit 2026-10-03)" w:date="2026-10-03T00:00:00Z">
         <w:r>
-          <w:t xml:space="preserve">The repository's automated suite: an automated test suite (run it with python -m unittest discover -s tests -t .). It covers every model, the inference pipeline, the REST API end to end, the serverless entrypoint, and regression tests for every hard-coded value removed in the October 2026 audit.</w:t>
+          <w:t xml:space="preserve">The repository's automated suite: all 201 automated tests passing (1 skipped by design). It covers every model, the inference pipeline, the REST API end to end, the serverless entrypoint, and regression tests for every hard-coded value removed in the October 2026 audit.</w:t>
         </w:r>
       </w:ins>
       <w:ins w:id="30384" w:author="Claude (fact-check vs repository)" w:date="2026-10-02T00:00:00Z"/>

</xml_diff>

<commit_message>
Serve the U-Net segmenter: pothole IoU 0.641 (was 0.144), clean-road false blobs 1.7% (was 23.3%)
</commit_message>
<xml_diff>
--- a/CSET485_ROAD_SHIELD_Milestone2_Report_Audited_TrackedChanges.docx
+++ b/CSET485_ROAD_SHIELD_Milestone2_Report_Audited_TrackedChanges.docx
@@ -733,7 +733,7 @@
       </w:ins>
       <w:ins w:id="30015" w:author="Claude (audit 2026-10-03)" w:date="2026-10-03T00:00:00Z">
         <w:r>
-          <w:t xml:space="preserve">our classifier scored 93.3% accuracy (macro-F1 0.828) on 630 images from 567 photographs it never saw, the hand-crafted baseline scored 84.9% on the same split, and the code has all 201 automated tests passing (1 skipped by design). On 1200 crops from held-out RDD2022 India photographs (split by photograph; no training run reads them), the classifier scored 92.3% accuracy (macro-F1 0.922)</w:t>
+          <w:t xml:space="preserve">our classifier scored 93.3% accuracy (macro-F1 0.828) on 630 images from 567 photographs it never saw, the hand-crafted baseline scored 84.9% on the same split, and the code has 201 automated tests, 200 passing and 1 failing (see logs/tests_after.txt). On 1200 crops from held-out RDD2022 India photographs (split by photograph; no training run reads them), the classifier scored 92.3% accuracy (macro-F1 0.922)</w:t>
         </w:r>
       </w:ins>
       <w:ins w:id="30016" w:author="Claude (fact-check vs repository)" w:date="2026-10-02T00:00:00Z">
@@ -4328,7 +4328,7 @@
       </w:del>
       <w:ins w:id="30136" w:author="Claude (audit 2026-10-03)" w:date="2026-10-03T00:00:00Z">
         <w:r>
-          <w:t xml:space="preserve">Finds candidate distress regions with an 11-feature pixel segmenter (gradient-boosted trees), whose pothole pixels are kept only where the CNN classifier also sees a pothole (semantic gate); painted markings are masked out first.</w:t>
+          <w:t xml:space="preserve">Finds candidate distress regions with a U-Net segmenter (ResNet-18 encoder, every layer trained on hand-drawn defect outlines, chosen over the pixel classifier on calibration photographs), whose pothole pixels are kept only where the CNN classifier also sees a pothole (semantic gate); painted markings are masked out first.</w:t>
         </w:r>
       </w:ins>
     </w:p>
@@ -7136,7 +7136,7 @@
       </w:ins>
       <w:ins w:id="30383" w:author="Claude (audit 2026-10-03)" w:date="2026-10-03T00:00:00Z">
         <w:r>
-          <w:t xml:space="preserve">The repository's automated suite: all 201 automated tests passing (1 skipped by design). It covers every model, the inference pipeline, the REST API end to end, the serverless entrypoint, and regression tests for every hard-coded value removed in the October 2026 audit.</w:t>
+          <w:t xml:space="preserve">The repository's automated suite: 201 automated tests, 200 passing and 1 failing (see logs/tests_after.txt). It covers every model, the inference pipeline, the REST API end to end, the serverless entrypoint, and regression tests for every hard-coded value removed in the October 2026 audit.</w:t>
         </w:r>
       </w:ins>
       <w:ins w:id="30384" w:author="Claude (fact-check vs repository)" w:date="2026-10-02T00:00:00Z"/>

</xml_diff>

<commit_message>
End-to-end check keeps the pixel segmenter (24/24 vs U-Net 9/24); U-Net reversal listed
</commit_message>
<xml_diff>
--- a/CSET485_ROAD_SHIELD_Milestone2_Report_Audited_TrackedChanges.docx
+++ b/CSET485_ROAD_SHIELD_Milestone2_Report_Audited_TrackedChanges.docx
@@ -733,7 +733,7 @@
       </w:ins>
       <w:ins w:id="30015" w:author="Claude (audit 2026-10-03)" w:date="2026-10-03T00:00:00Z">
         <w:r>
-          <w:t xml:space="preserve">our classifier scored 93.3% accuracy (macro-F1 0.828) on 630 images from 567 photographs it never saw, the hand-crafted baseline scored 84.9% on the same split, and the code has 201 automated tests, 200 passing and 1 failing (see logs/tests_after.txt). On 1200 crops from held-out RDD2022 India photographs (split by photograph; no training run reads them), the classifier scored 92.3% accuracy (macro-F1 0.922)</w:t>
+          <w:t xml:space="preserve">our classifier scored 93.3% accuracy (macro-F1 0.828) on 630 images from 567 photographs it never saw, the hand-crafted baseline scored 84.9% on the same split, and the code has all 201 automated tests passing (1 skipped by design). On 1200 crops from held-out RDD2022 India photographs (split by photograph; no training run reads them), the classifier scored 92.3% accuracy (macro-F1 0.922)</w:t>
         </w:r>
       </w:ins>
       <w:ins w:id="30016" w:author="Claude (fact-check vs repository)" w:date="2026-10-02T00:00:00Z">
@@ -4328,7 +4328,7 @@
       </w:del>
       <w:ins w:id="30136" w:author="Claude (audit 2026-10-03)" w:date="2026-10-03T00:00:00Z">
         <w:r>
-          <w:t xml:space="preserve">Finds candidate distress regions with a U-Net segmenter (ResNet-18 encoder, every layer trained on hand-drawn defect outlines, chosen over the pixel classifier on calibration photographs), whose pothole pixels are kept only where the CNN classifier also sees a pothole (semantic gate); painted markings are masked out first.</w:t>
+          <w:t xml:space="preserve">Finds candidate distress regions with an 11-feature pixel segmenter (gradient-boosted trees), whose pothole pixels are kept only where the CNN classifier also sees a pothole (semantic gate); painted markings are masked out first.</w:t>
         </w:r>
       </w:ins>
     </w:p>
@@ -7136,7 +7136,7 @@
       </w:ins>
       <w:ins w:id="30383" w:author="Claude (audit 2026-10-03)" w:date="2026-10-03T00:00:00Z">
         <w:r>
-          <w:t xml:space="preserve">The repository's automated suite: 201 automated tests, 200 passing and 1 failing (see logs/tests_after.txt). It covers every model, the inference pipeline, the REST API end to end, the serverless entrypoint, and regression tests for every hard-coded value removed in the October 2026 audit.</w:t>
+          <w:t xml:space="preserve">The repository's automated suite: all 201 automated tests passing (1 skipped by design). It covers every model, the inference pipeline, the REST API end to end, the serverless entrypoint, and regression tests for every hard-coded value removed in the October 2026 audit.</w:t>
         </w:r>
       </w:ins>
       <w:ins w:id="30384" w:author="Claude (fact-check vs repository)" w:date="2026-10-02T00:00:00Z"/>

</xml_diff>

<commit_message>
Multi-dataset U-Net: Kaggle pothole IoU 0.679 vs 0.035, kept unserved by the IoU rule (DNIT crack 0.184 < 0.214)
</commit_message>
<xml_diff>
--- a/CSET485_ROAD_SHIELD_Milestone2_Report_Audited_TrackedChanges.docx
+++ b/CSET485_ROAD_SHIELD_Milestone2_Report_Audited_TrackedChanges.docx
@@ -733,7 +733,7 @@
       </w:ins>
       <w:ins w:id="30015" w:author="Claude (audit 2026-10-03)" w:date="2026-10-03T00:00:00Z">
         <w:r>
-          <w:t xml:space="preserve">our classifier scored 93.3% accuracy (macro-F1 0.828) on 630 images from 567 photographs it never saw, the hand-crafted baseline scored 84.9% on the same split, and the code has all 201 automated tests passing (1 skipped by design). On 1200 crops from held-out RDD2022 India photographs (split by photograph; no training run reads them), the classifier scored 92.3% accuracy (macro-F1 0.922)</w:t>
+          <w:t xml:space="preserve">our classifier scored 93.3% accuracy (macro-F1 0.828) on 630 images from 567 photographs it never saw, the hand-crafted baseline scored 84.9% on the same split, and the code has all 209 automated tests passing (1 skipped by design). On 1200 crops from held-out RDD2022 India photographs (split by photograph; no training run reads them), the classifier scored 92.3% accuracy (macro-F1 0.922)</w:t>
         </w:r>
       </w:ins>
       <w:ins w:id="30016" w:author="Claude (fact-check vs repository)" w:date="2026-10-02T00:00:00Z">
@@ -7136,7 +7136,7 @@
       </w:ins>
       <w:ins w:id="30383" w:author="Claude (audit 2026-10-03)" w:date="2026-10-03T00:00:00Z">
         <w:r>
-          <w:t xml:space="preserve">The repository's automated suite: all 201 automated tests passing (1 skipped by design). It covers every model, the inference pipeline, the REST API end to end, the serverless entrypoint, and regression tests for every hard-coded value removed in the October 2026 audit.</w:t>
+          <w:t xml:space="preserve">The repository's automated suite: all 209 automated tests passing (1 skipped by design). It covers every model, the inference pipeline, the REST API end to end, the serverless entrypoint, and regression tests for every hard-coded value removed in the October 2026 audit.</w:t>
         </w:r>
       </w:ins>
       <w:ins w:id="30384" w:author="Claude (fact-check vs repository)" w:date="2026-10-02T00:00:00Z"/>

</xml_diff>